<commit_message>
add(roster): CONTACTS.csv — 39-row contact list (company/person/position/email/phone/route/source); embedded in PROSPECT-INDICATORS + battlemap docx (verified 40-row table renders)
</commit_message>
<xml_diff>
--- a/roster/MALAYSIA-BATTLEMAP.docx
+++ b/roster/MALAYSIA-BATTLEMAP.docx
@@ -12,7 +12,7 @@
     </w:p>
     <w:p>
       <w:r>
-        <w:t>_Compiled 2026-10-10 · Sources: dated, click-verified OSINT (postings APIs, procurement pages, parliamentary records, official pages, reputable press 2+ corroborations). Confidence tags per claim. Internal use — strip Appendix C before external circulation._</w:t>
+        <w:t>_Compiled 2026-10-10 · Sources: dated, click-verified OSINT (postings APIs, procurement pages, parliamentary records, official pages, reputable press 2+ corroborations). Internal use — strip contact table before external circulation._</w:t>
       </w:r>
     </w:p>
     <w:p>
@@ -26,6 +26,2714 @@
     <w:p>
       <w:r>
         <w:t>v2 · 2026-10-10 (rebuilt after 4-lane deep sweep). Every indicator = dated, click-verified event; full sourcing in my-contact-dossier.md v3 + PROSPECT-SIGNALS.md (raw evidence in evidence/signals-20261010/). Ranked by "why they buy NOW."</w:t>
+      </w:r>
+    </w:p>
+    <w:p>
+      <w:pPr>
+        <w:pStyle w:val="Heading2"/>
+      </w:pPr>
+      <w:r>
+        <w:t>📇 CONTACT LIST (company · person · position · email · phone)</w:t>
+      </w:r>
+    </w:p>
+    <w:tbl>
+      <w:tblPr>
+        <w:tblStyle w:val="LightGrid-Accent1"/>
+        <w:tblW w:type="auto" w:w="0"/>
+        <w:tblLook w:firstColumn="1" w:firstRow="1" w:lastColumn="0" w:lastRow="0" w:noHBand="0" w:noVBand="1" w:val="04A0"/>
+      </w:tblPr>
+      <w:tblGrid>
+        <w:gridCol w:w="1728"/>
+        <w:gridCol w:w="1728"/>
+        <w:gridCol w:w="1728"/>
+        <w:gridCol w:w="1728"/>
+        <w:gridCol w:w="1728"/>
+      </w:tblGrid>
+      <w:tr>
+        <w:tc>
+          <w:tcPr>
+            <w:tcW w:type="dxa" w:w="1728"/>
+          </w:tcPr>
+          <w:p>
+            <w:r>
+              <w:rPr>
+                <w:b/>
+              </w:rPr>
+              <w:t>Company</w:t>
+            </w:r>
+          </w:p>
+        </w:tc>
+        <w:tc>
+          <w:tcPr>
+            <w:tcW w:type="dxa" w:w="1728"/>
+          </w:tcPr>
+          <w:p>
+            <w:r>
+              <w:rPr>
+                <w:b/>
+              </w:rPr>
+              <w:t>Person</w:t>
+            </w:r>
+          </w:p>
+        </w:tc>
+        <w:tc>
+          <w:tcPr>
+            <w:tcW w:type="dxa" w:w="1728"/>
+          </w:tcPr>
+          <w:p>
+            <w:r>
+              <w:rPr>
+                <w:b/>
+              </w:rPr>
+              <w:t>Position</w:t>
+            </w:r>
+          </w:p>
+        </w:tc>
+        <w:tc>
+          <w:tcPr>
+            <w:tcW w:type="dxa" w:w="1728"/>
+          </w:tcPr>
+          <w:p>
+            <w:r>
+              <w:rPr>
+                <w:b/>
+              </w:rPr>
+              <w:t>Email</w:t>
+            </w:r>
+          </w:p>
+        </w:tc>
+        <w:tc>
+          <w:tcPr>
+            <w:tcW w:type="dxa" w:w="1728"/>
+          </w:tcPr>
+          <w:p>
+            <w:r>
+              <w:rPr>
+                <w:b/>
+              </w:rPr>
+              <w:t>Phone</w:t>
+            </w:r>
+          </w:p>
+        </w:tc>
+      </w:tr>
+      <w:tr>
+        <w:tc>
+          <w:tcPr>
+            <w:tcW w:type="dxa" w:w="1728"/>
+          </w:tcPr>
+          <w:p>
+            <w:r>
+              <w:rPr>
+                <w:sz w:val="19"/>
+              </w:rPr>
+              <w:t>PDRM JSJK/CCID (MY-01)</w:t>
+            </w:r>
+          </w:p>
+        </w:tc>
+        <w:tc>
+          <w:tcPr>
+            <w:tcW w:type="dxa" w:w="1728"/>
+          </w:tcPr>
+          <w:p>
+            <w:r>
+              <w:rPr>
+                <w:sz w:val="19"/>
+              </w:rPr>
+              <w:t>ASP Nurul Aqila binti Md Sedik</w:t>
+            </w:r>
+          </w:p>
+        </w:tc>
+        <w:tc>
+          <w:tcPr>
+            <w:tcW w:type="dxa" w:w="1728"/>
+          </w:tcPr>
+          <w:p>
+            <w:r>
+              <w:rPr>
+                <w:sz w:val="19"/>
+              </w:rPr>
+              <w:t>Kryptowang Unit, JSJK Bukit Aman</w:t>
+            </w:r>
+          </w:p>
+        </w:tc>
+        <w:tc>
+          <w:tcPr>
+            <w:tcW w:type="dxa" w:w="1728"/>
+          </w:tcPr>
+          <w:p>
+            <w:r>
+              <w:rPr>
+                <w:sz w:val="19"/>
+              </w:rPr>
+              <w:t>aqila@rmp.gov.my</w:t>
+            </w:r>
+          </w:p>
+        </w:tc>
+        <w:tc>
+          <w:tcPr>
+            <w:tcW w:type="dxa" w:w="1728"/>
+          </w:tcPr>
+          <w:p>
+            <w:r>
+              <w:rPr>
+                <w:sz w:val="19"/>
+              </w:rPr>
+              <w:t>019-7915377</w:t>
+            </w:r>
+          </w:p>
+        </w:tc>
+      </w:tr>
+      <w:tr>
+        <w:tc>
+          <w:tcPr>
+            <w:tcW w:type="dxa" w:w="1728"/>
+          </w:tcPr>
+          <w:p>
+            <w:r>
+              <w:rPr>
+                <w:sz w:val="19"/>
+              </w:rPr>
+              <w:t>PDRM JSJK/CCID (MY-01)</w:t>
+            </w:r>
+          </w:p>
+        </w:tc>
+        <w:tc>
+          <w:tcPr>
+            <w:tcW w:type="dxa" w:w="1728"/>
+          </w:tcPr>
+          <w:p>
+            <w:r>
+              <w:rPr>
+                <w:sz w:val="19"/>
+              </w:rPr>
+              <w:t>Datuk Rusdi Mohd Isa</w:t>
+            </w:r>
+          </w:p>
+        </w:tc>
+        <w:tc>
+          <w:tcPr>
+            <w:tcW w:type="dxa" w:w="1728"/>
+          </w:tcPr>
+          <w:p>
+            <w:r>
+              <w:rPr>
+                <w:sz w:val="19"/>
+              </w:rPr>
+              <w:t>Director CCID / Pengarah JSJK (budget holder)</w:t>
+            </w:r>
+          </w:p>
+        </w:tc>
+        <w:tc>
+          <w:tcPr>
+            <w:tcW w:type="dxa" w:w="1728"/>
+          </w:tcPr>
+          <w:p>
+            <w:r>
+              <w:rPr>
+                <w:sz w:val="19"/>
+              </w:rPr>
+              <w:t>none published</w:t>
+            </w:r>
+          </w:p>
+        </w:tc>
+        <w:tc>
+          <w:tcPr>
+            <w:tcW w:type="dxa" w:w="1728"/>
+          </w:tcPr>
+          <w:p>
+            <w:r>
+              <w:rPr>
+                <w:sz w:val="19"/>
+              </w:rPr>
+              <w:t>03-26101222 (HQ) / 03-26101599 (ops room)</w:t>
+            </w:r>
+          </w:p>
+        </w:tc>
+      </w:tr>
+      <w:tr>
+        <w:tc>
+          <w:tcPr>
+            <w:tcW w:type="dxa" w:w="1728"/>
+          </w:tcPr>
+          <w:p>
+            <w:r>
+              <w:rPr>
+                <w:sz w:val="19"/>
+              </w:rPr>
+              <w:t>PDRM JSJK/CCID (MY-01)</w:t>
+            </w:r>
+          </w:p>
+        </w:tc>
+        <w:tc>
+          <w:tcPr>
+            <w:tcW w:type="dxa" w:w="1728"/>
+          </w:tcPr>
+          <w:p>
+            <w:r>
+              <w:rPr>
+                <w:sz w:val="19"/>
+              </w:rPr>
+              <w:t>DCP Shamsul Amar Ramli</w:t>
+            </w:r>
+          </w:p>
+        </w:tc>
+        <w:tc>
+          <w:tcPr>
+            <w:tcW w:type="dxa" w:w="1728"/>
+          </w:tcPr>
+          <w:p>
+            <w:r>
+              <w:rPr>
+                <w:sz w:val="19"/>
+              </w:rPr>
+              <w:t>Timbalan Pengarah (Siasatan Jenayah Siber) — crypto-branch superior</w:t>
+            </w:r>
+          </w:p>
+        </w:tc>
+        <w:tc>
+          <w:tcPr>
+            <w:tcW w:type="dxa" w:w="1728"/>
+          </w:tcPr>
+          <w:p>
+            <w:r>
+              <w:rPr>
+                <w:sz w:val="19"/>
+              </w:rPr>
+              <w:t>none published</w:t>
+            </w:r>
+          </w:p>
+        </w:tc>
+        <w:tc>
+          <w:tcPr>
+            <w:tcW w:type="dxa" w:w="1728"/>
+          </w:tcPr>
+          <w:p>
+            <w:r>
+              <w:rPr>
+                <w:sz w:val="19"/>
+              </w:rPr>
+              <w:t>03-26101222</w:t>
+            </w:r>
+          </w:p>
+        </w:tc>
+      </w:tr>
+      <w:tr>
+        <w:tc>
+          <w:tcPr>
+            <w:tcW w:type="dxa" w:w="1728"/>
+          </w:tcPr>
+          <w:p>
+            <w:r>
+              <w:rPr>
+                <w:sz w:val="19"/>
+              </w:rPr>
+              <w:t>PDRM JSJK/CCID (MY-01)</w:t>
+            </w:r>
+          </w:p>
+        </w:tc>
+        <w:tc>
+          <w:tcPr>
+            <w:tcW w:type="dxa" w:w="1728"/>
+          </w:tcPr>
+          <w:p>
+            <w:r>
+              <w:rPr>
+                <w:sz w:val="19"/>
+              </w:rPr>
+              <w:t>Ts. Mail bin Yussof, DSP</w:t>
+            </w:r>
+          </w:p>
+        </w:tc>
+        <w:tc>
+          <w:tcPr>
+            <w:tcW w:type="dxa" w:w="1728"/>
+          </w:tcPr>
+          <w:p>
+            <w:r>
+              <w:rPr>
+                <w:sz w:val="19"/>
+              </w:rPr>
+              <w:t>Senior Investigating Officer PCIRC(I) (crypto unit)</w:t>
+            </w:r>
+          </w:p>
+        </w:tc>
+        <w:tc>
+          <w:tcPr>
+            <w:tcW w:type="dxa" w:w="1728"/>
+          </w:tcPr>
+          <w:p>
+            <w:r>
+              <w:rPr>
+                <w:sz w:val="19"/>
+              </w:rPr>
+              <w:t>none published</w:t>
+            </w:r>
+          </w:p>
+        </w:tc>
+        <w:tc>
+          <w:tcPr>
+            <w:tcW w:type="dxa" w:w="1728"/>
+          </w:tcPr>
+          <w:p>
+            <w:r>
+              <w:rPr>
+                <w:sz w:val="19"/>
+              </w:rPr>
+              <w:t>03-26101222</w:t>
+            </w:r>
+          </w:p>
+        </w:tc>
+      </w:tr>
+      <w:tr>
+        <w:tc>
+          <w:tcPr>
+            <w:tcW w:type="dxa" w:w="1728"/>
+          </w:tcPr>
+          <w:p>
+            <w:r>
+              <w:rPr>
+                <w:sz w:val="19"/>
+              </w:rPr>
+              <w:t>PDRM JSJK/CCID (MY-01)</w:t>
+            </w:r>
+          </w:p>
+        </w:tc>
+        <w:tc>
+          <w:tcPr>
+            <w:tcW w:type="dxa" w:w="1728"/>
+          </w:tcPr>
+          <w:p>
+            <w:r>
+              <w:rPr>
+                <w:sz w:val="19"/>
+              </w:rPr>
+              <w:t>SAC Mohamad Lazim bin Ismail</w:t>
+            </w:r>
+          </w:p>
+        </w:tc>
+        <w:tc>
+          <w:tcPr>
+            <w:tcW w:type="dxa" w:w="1728"/>
+          </w:tcPr>
+          <w:p>
+            <w:r>
+              <w:rPr>
+                <w:sz w:val="19"/>
+              </w:rPr>
+              <w:t>Timbalan Pengarah (Perancangan Strategik) — planning/budget</w:t>
+            </w:r>
+          </w:p>
+        </w:tc>
+        <w:tc>
+          <w:tcPr>
+            <w:tcW w:type="dxa" w:w="1728"/>
+          </w:tcPr>
+          <w:p>
+            <w:r>
+              <w:rPr>
+                <w:sz w:val="19"/>
+              </w:rPr>
+              <w:t>none published</w:t>
+            </w:r>
+          </w:p>
+        </w:tc>
+        <w:tc>
+          <w:tcPr>
+            <w:tcW w:type="dxa" w:w="1728"/>
+          </w:tcPr>
+          <w:p>
+            <w:r>
+              <w:rPr>
+                <w:sz w:val="19"/>
+              </w:rPr>
+              <w:t>03-26101222</w:t>
+            </w:r>
+          </w:p>
+        </w:tc>
+      </w:tr>
+      <w:tr>
+        <w:tc>
+          <w:tcPr>
+            <w:tcW w:type="dxa" w:w="1728"/>
+          </w:tcPr>
+          <w:p>
+            <w:r>
+              <w:rPr>
+                <w:sz w:val="19"/>
+              </w:rPr>
+              <w:t>Bank Negara — FIED (MY-02)</w:t>
+            </w:r>
+          </w:p>
+        </w:tc>
+        <w:tc>
+          <w:tcPr>
+            <w:tcW w:type="dxa" w:w="1728"/>
+          </w:tcPr>
+          <w:p>
+            <w:r>
+              <w:rPr>
+                <w:sz w:val="19"/>
+              </w:rPr>
+              <w:t>Mohd Fuad Arshad</w:t>
+            </w:r>
+          </w:p>
+        </w:tc>
+        <w:tc>
+          <w:tcPr>
+            <w:tcW w:type="dxa" w:w="1728"/>
+          </w:tcPr>
+          <w:p>
+            <w:r>
+              <w:rPr>
+                <w:sz w:val="19"/>
+              </w:rPr>
+              <w:t>Director, Financial Intelligence &amp; Enforcement Dept (FIED)</w:t>
+            </w:r>
+          </w:p>
+        </w:tc>
+        <w:tc>
+          <w:tcPr>
+            <w:tcW w:type="dxa" w:w="1728"/>
+          </w:tcPr>
+          <w:p>
+            <w:r>
+              <w:rPr>
+                <w:sz w:val="19"/>
+              </w:rPr>
+              <w:t>none published</w:t>
+            </w:r>
+          </w:p>
+        </w:tc>
+        <w:tc>
+          <w:tcPr>
+            <w:tcW w:type="dxa" w:w="1728"/>
+          </w:tcPr>
+          <w:p>
+            <w:r>
+              <w:rPr>
+                <w:sz w:val="19"/>
+              </w:rPr>
+              <w:t>03-2616 0000 (BNM main)</w:t>
+            </w:r>
+          </w:p>
+        </w:tc>
+      </w:tr>
+      <w:tr>
+        <w:tc>
+          <w:tcPr>
+            <w:tcW w:type="dxa" w:w="1728"/>
+          </w:tcPr>
+          <w:p>
+            <w:r>
+              <w:rPr>
+                <w:sz w:val="19"/>
+              </w:rPr>
+              <w:t>Bank Negara — FIED (MY-02)</w:t>
+            </w:r>
+          </w:p>
+        </w:tc>
+        <w:tc>
+          <w:tcPr>
+            <w:tcW w:type="dxa" w:w="1728"/>
+          </w:tcPr>
+          <w:p>
+            <w:r>
+              <w:rPr>
+                <w:sz w:val="19"/>
+              </w:rPr>
+              <w:t>June Lian (Lay Choon)</w:t>
+            </w:r>
+          </w:p>
+        </w:tc>
+        <w:tc>
+          <w:tcPr>
+            <w:tcW w:type="dxa" w:w="1728"/>
+          </w:tcPr>
+          <w:p>
+            <w:r>
+              <w:rPr>
+                <w:sz w:val="19"/>
+              </w:rPr>
+              <w:t>Deputy Director, FIED</w:t>
+            </w:r>
+          </w:p>
+        </w:tc>
+        <w:tc>
+          <w:tcPr>
+            <w:tcW w:type="dxa" w:w="1728"/>
+          </w:tcPr>
+          <w:p>
+            <w:r>
+              <w:rPr>
+                <w:sz w:val="19"/>
+              </w:rPr>
+              <w:t>none published</w:t>
+            </w:r>
+          </w:p>
+        </w:tc>
+        <w:tc>
+          <w:tcPr>
+            <w:tcW w:type="dxa" w:w="1728"/>
+          </w:tcPr>
+          <w:p>
+            <w:r>
+              <w:rPr>
+                <w:sz w:val="19"/>
+              </w:rPr>
+              <w:t>03-2616 0000</w:t>
+            </w:r>
+          </w:p>
+        </w:tc>
+      </w:tr>
+      <w:tr>
+        <w:tc>
+          <w:tcPr>
+            <w:tcW w:type="dxa" w:w="1728"/>
+          </w:tcPr>
+          <w:p>
+            <w:r>
+              <w:rPr>
+                <w:sz w:val="19"/>
+              </w:rPr>
+              <w:t>Bank Negara (MY-02)</w:t>
+            </w:r>
+          </w:p>
+        </w:tc>
+        <w:tc>
+          <w:tcPr>
+            <w:tcW w:type="dxa" w:w="1728"/>
+          </w:tcPr>
+          <w:p>
+            <w:r>
+              <w:rPr>
+                <w:sz w:val="19"/>
+              </w:rPr>
+              <w:t>Dato' Sri Shaik Abdul Rasheed bin Abdul Ghaffour</w:t>
+            </w:r>
+          </w:p>
+        </w:tc>
+        <w:tc>
+          <w:tcPr>
+            <w:tcW w:type="dxa" w:w="1728"/>
+          </w:tcPr>
+          <w:p>
+            <w:r>
+              <w:rPr>
+                <w:sz w:val="19"/>
+              </w:rPr>
+              <w:t>Governor (term to Jun-2028)</w:t>
+            </w:r>
+          </w:p>
+        </w:tc>
+        <w:tc>
+          <w:tcPr>
+            <w:tcW w:type="dxa" w:w="1728"/>
+          </w:tcPr>
+          <w:p>
+            <w:r>
+              <w:rPr>
+                <w:sz w:val="19"/>
+              </w:rPr>
+              <w:t>none published</w:t>
+            </w:r>
+          </w:p>
+        </w:tc>
+        <w:tc>
+          <w:tcPr>
+            <w:tcW w:type="dxa" w:w="1728"/>
+          </w:tcPr>
+          <w:p>
+            <w:r>
+              <w:rPr>
+                <w:sz w:val="19"/>
+              </w:rPr>
+              <w:t>03-2616 0000</w:t>
+            </w:r>
+          </w:p>
+        </w:tc>
+      </w:tr>
+      <w:tr>
+        <w:tc>
+          <w:tcPr>
+            <w:tcW w:type="dxa" w:w="1728"/>
+          </w:tcPr>
+          <w:p>
+            <w:r>
+              <w:rPr>
+                <w:sz w:val="19"/>
+              </w:rPr>
+              <w:t>Securities Commission (MY-03)</w:t>
+            </w:r>
+          </w:p>
+        </w:tc>
+        <w:tc>
+          <w:tcPr>
+            <w:tcW w:type="dxa" w:w="1728"/>
+          </w:tcPr>
+          <w:p>
+            <w:r>
+              <w:rPr>
+                <w:sz w:val="19"/>
+              </w:rPr>
+              <w:t>Dr Wong Huei Ching</w:t>
+            </w:r>
+          </w:p>
+        </w:tc>
+        <w:tc>
+          <w:tcPr>
+            <w:tcW w:type="dxa" w:w="1728"/>
+          </w:tcPr>
+          <w:p>
+            <w:r>
+              <w:rPr>
+                <w:sz w:val="19"/>
+              </w:rPr>
+              <w:t>Executive Director, Digital Strategy &amp; Innovation — the digital-asset door</w:t>
+            </w:r>
+          </w:p>
+        </w:tc>
+        <w:tc>
+          <w:tcPr>
+            <w:tcW w:type="dxa" w:w="1728"/>
+          </w:tcPr>
+          <w:p>
+            <w:r>
+              <w:rPr>
+                <w:sz w:val="19"/>
+              </w:rPr>
+              <w:t>cau@seccom.com.my (general) / supervision@seccom.com.my</w:t>
+            </w:r>
+          </w:p>
+        </w:tc>
+        <w:tc>
+          <w:tcPr>
+            <w:tcW w:type="dxa" w:w="1728"/>
+          </w:tcPr>
+          <w:p>
+            <w:r>
+              <w:rPr>
+                <w:sz w:val="19"/>
+              </w:rPr>
+              <w:t>03-6204 8000 (main)</w:t>
+            </w:r>
+          </w:p>
+        </w:tc>
+      </w:tr>
+      <w:tr>
+        <w:tc>
+          <w:tcPr>
+            <w:tcW w:type="dxa" w:w="1728"/>
+          </w:tcPr>
+          <w:p>
+            <w:r>
+              <w:rPr>
+                <w:sz w:val="19"/>
+              </w:rPr>
+              <w:t>Securities Commission (MY-03)</w:t>
+            </w:r>
+          </w:p>
+        </w:tc>
+        <w:tc>
+          <w:tcPr>
+            <w:tcW w:type="dxa" w:w="1728"/>
+          </w:tcPr>
+          <w:p>
+            <w:r>
+              <w:rPr>
+                <w:sz w:val="19"/>
+              </w:rPr>
+              <w:t>Datuk Manoj Kurup</w:t>
+            </w:r>
+          </w:p>
+        </w:tc>
+        <w:tc>
+          <w:tcPr>
+            <w:tcW w:type="dxa" w:w="1728"/>
+          </w:tcPr>
+          <w:p>
+            <w:r>
+              <w:rPr>
+                <w:sz w:val="19"/>
+              </w:rPr>
+              <w:t>Executive Director, Enforcement (eff. 8-Apr-26)</w:t>
+            </w:r>
+          </w:p>
+        </w:tc>
+        <w:tc>
+          <w:tcPr>
+            <w:tcW w:type="dxa" w:w="1728"/>
+          </w:tcPr>
+          <w:p>
+            <w:r>
+              <w:rPr>
+                <w:sz w:val="19"/>
+              </w:rPr>
+              <w:t>aduan@seccom.com.my (complaints channel only)</w:t>
+            </w:r>
+          </w:p>
+        </w:tc>
+        <w:tc>
+          <w:tcPr>
+            <w:tcW w:type="dxa" w:w="1728"/>
+          </w:tcPr>
+          <w:p>
+            <w:r>
+              <w:rPr>
+                <w:sz w:val="19"/>
+              </w:rPr>
+              <w:t>03-6204 8000</w:t>
+            </w:r>
+          </w:p>
+        </w:tc>
+      </w:tr>
+      <w:tr>
+        <w:tc>
+          <w:tcPr>
+            <w:tcW w:type="dxa" w:w="1728"/>
+          </w:tcPr>
+          <w:p>
+            <w:r>
+              <w:rPr>
+                <w:sz w:val="19"/>
+              </w:rPr>
+              <w:t>Securities Commission (MY-03)</w:t>
+            </w:r>
+          </w:p>
+        </w:tc>
+        <w:tc>
+          <w:tcPr>
+            <w:tcW w:type="dxa" w:w="1728"/>
+          </w:tcPr>
+          <w:p>
+            <w:r>
+              <w:rPr>
+                <w:sz w:val="19"/>
+              </w:rPr>
+              <w:t>Datin Paduka Azalina Adham</w:t>
+            </w:r>
+          </w:p>
+        </w:tc>
+        <w:tc>
+          <w:tcPr>
+            <w:tcW w:type="dxa" w:w="1728"/>
+          </w:tcPr>
+          <w:p>
+            <w:r>
+              <w:rPr>
+                <w:sz w:val="19"/>
+              </w:rPr>
+              <w:t>Managing Director</w:t>
+            </w:r>
+          </w:p>
+        </w:tc>
+        <w:tc>
+          <w:tcPr>
+            <w:tcW w:type="dxa" w:w="1728"/>
+          </w:tcPr>
+          <w:p>
+            <w:r>
+              <w:rPr>
+                <w:sz w:val="19"/>
+              </w:rPr>
+              <w:t>cau@seccom.com.my</w:t>
+            </w:r>
+          </w:p>
+        </w:tc>
+        <w:tc>
+          <w:tcPr>
+            <w:tcW w:type="dxa" w:w="1728"/>
+          </w:tcPr>
+          <w:p>
+            <w:r>
+              <w:rPr>
+                <w:sz w:val="19"/>
+              </w:rPr>
+              <w:t>03-6204 8000</w:t>
+            </w:r>
+          </w:p>
+        </w:tc>
+      </w:tr>
+      <w:tr>
+        <w:tc>
+          <w:tcPr>
+            <w:tcW w:type="dxa" w:w="1728"/>
+          </w:tcPr>
+          <w:p>
+            <w:r>
+              <w:rPr>
+                <w:sz w:val="19"/>
+              </w:rPr>
+              <w:t>NACSA (MY-04)</w:t>
+            </w:r>
+          </w:p>
+        </w:tc>
+        <w:tc>
+          <w:tcPr>
+            <w:tcW w:type="dxa" w:w="1728"/>
+          </w:tcPr>
+          <w:p>
+            <w:r>
+              <w:rPr>
+                <w:sz w:val="19"/>
+              </w:rPr>
+              <w:t>Ir. Dr. Megat Zuhairy Megat Zamel</w:t>
+            </w:r>
+          </w:p>
+        </w:tc>
+        <w:tc>
+          <w:tcPr>
+            <w:tcW w:type="dxa" w:w="1728"/>
+          </w:tcPr>
+          <w:p>
+            <w:r>
+              <w:rPr>
+                <w:sz w:val="19"/>
+              </w:rPr>
+              <w:t>Chief Executive Officer</w:t>
+            </w:r>
+          </w:p>
+        </w:tc>
+        <w:tc>
+          <w:tcPr>
+            <w:tcW w:type="dxa" w:w="1728"/>
+          </w:tcPr>
+          <w:p>
+            <w:r>
+              <w:rPr>
+                <w:sz w:val="19"/>
+              </w:rPr>
+              <w:t>none published — use Aras warm channel</w:t>
+            </w:r>
+          </w:p>
+        </w:tc>
+        <w:tc>
+          <w:tcPr>
+            <w:tcW w:type="dxa" w:w="1728"/>
+          </w:tcPr>
+          <w:p>
+            <w:r>
+              <w:rPr>
+                <w:sz w:val="19"/>
+              </w:rPr>
+              <w:t>none published</w:t>
+            </w:r>
+          </w:p>
+        </w:tc>
+      </w:tr>
+      <w:tr>
+        <w:tc>
+          <w:tcPr>
+            <w:tcW w:type="dxa" w:w="1728"/>
+          </w:tcPr>
+          <w:p>
+            <w:r>
+              <w:rPr>
+                <w:sz w:val="19"/>
+              </w:rPr>
+              <w:t>NACSA NC4</w:t>
+            </w:r>
+          </w:p>
+        </w:tc>
+        <w:tc>
+          <w:tcPr>
+            <w:tcW w:type="dxa" w:w="1728"/>
+          </w:tcPr>
+          <w:p>
+            <w:r>
+              <w:rPr>
+                <w:sz w:val="19"/>
+              </w:rPr>
+              <w:t>Datin Siti Hanizah binti Mohd Hanafiah</w:t>
+            </w:r>
+          </w:p>
+        </w:tc>
+        <w:tc>
+          <w:tcPr>
+            <w:tcW w:type="dxa" w:w="1728"/>
+          </w:tcPr>
+          <w:p>
+            <w:r>
+              <w:rPr>
+                <w:sz w:val="19"/>
+              </w:rPr>
+              <w:t>Director, NC4 (National Cyber Coordination &amp; Command Centre)</w:t>
+            </w:r>
+          </w:p>
+        </w:tc>
+        <w:tc>
+          <w:tcPr>
+            <w:tcW w:type="dxa" w:w="1728"/>
+          </w:tcPr>
+          <w:p>
+            <w:r>
+              <w:rPr>
+                <w:sz w:val="19"/>
+              </w:rPr>
+              <w:t>none published</w:t>
+            </w:r>
+          </w:p>
+        </w:tc>
+        <w:tc>
+          <w:tcPr>
+            <w:tcW w:type="dxa" w:w="1728"/>
+          </w:tcPr>
+          <w:p>
+            <w:r>
+              <w:rPr>
+                <w:sz w:val="19"/>
+              </w:rPr>
+              <w:t>via NACSA main</w:t>
+            </w:r>
+          </w:p>
+        </w:tc>
+      </w:tr>
+      <w:tr>
+        <w:tc>
+          <w:tcPr>
+            <w:tcW w:type="dxa" w:w="1728"/>
+          </w:tcPr>
+          <w:p>
+            <w:r>
+              <w:rPr>
+                <w:sz w:val="19"/>
+              </w:rPr>
+              <w:t>NACSA NC4</w:t>
+            </w:r>
+          </w:p>
+        </w:tc>
+        <w:tc>
+          <w:tcPr>
+            <w:tcW w:type="dxa" w:w="1728"/>
+          </w:tcPr>
+          <w:p>
+            <w:r>
+              <w:rPr>
+                <w:sz w:val="19"/>
+              </w:rPr>
+              <w:t>Ts. Mohamed Kheirulnaim</w:t>
+            </w:r>
+          </w:p>
+        </w:tc>
+        <w:tc>
+          <w:tcPr>
+            <w:tcW w:type="dxa" w:w="1728"/>
+          </w:tcPr>
+          <w:p>
+            <w:r>
+              <w:rPr>
+                <w:sz w:val="19"/>
+              </w:rPr>
+              <w:t>Head of Incident Response &amp; Cyber Threat Intelligence, NC4</w:t>
+            </w:r>
+          </w:p>
+        </w:tc>
+        <w:tc>
+          <w:tcPr>
+            <w:tcW w:type="dxa" w:w="1728"/>
+          </w:tcPr>
+          <w:p>
+            <w:r>
+              <w:rPr>
+                <w:sz w:val="19"/>
+              </w:rPr>
+              <w:t>none published</w:t>
+            </w:r>
+          </w:p>
+        </w:tc>
+        <w:tc>
+          <w:tcPr>
+            <w:tcW w:type="dxa" w:w="1728"/>
+          </w:tcPr>
+          <w:p>
+            <w:r>
+              <w:rPr>
+                <w:sz w:val="19"/>
+              </w:rPr>
+              <w:t>via NACSA main</w:t>
+            </w:r>
+          </w:p>
+        </w:tc>
+      </w:tr>
+      <w:tr>
+        <w:tc>
+          <w:tcPr>
+            <w:tcW w:type="dxa" w:w="1728"/>
+          </w:tcPr>
+          <w:p>
+            <w:r>
+              <w:rPr>
+                <w:sz w:val="19"/>
+              </w:rPr>
+              <w:t>CyberSecurity Malaysia (MY-05)</w:t>
+            </w:r>
+          </w:p>
+        </w:tc>
+        <w:tc>
+          <w:tcPr>
+            <w:tcW w:type="dxa" w:w="1728"/>
+          </w:tcPr>
+          <w:p>
+            <w:r>
+              <w:rPr>
+                <w:sz w:val="19"/>
+              </w:rPr>
+              <w:t>Roshdi Ahmad</w:t>
+            </w:r>
+          </w:p>
+        </w:tc>
+        <w:tc>
+          <w:tcPr>
+            <w:tcW w:type="dxa" w:w="1728"/>
+          </w:tcPr>
+          <w:p>
+            <w:r>
+              <w:rPr>
+                <w:sz w:val="19"/>
+              </w:rPr>
+              <w:t>Acting Chief Executive Officer (permanent appt pending = capability-review window)</w:t>
+            </w:r>
+          </w:p>
+        </w:tc>
+        <w:tc>
+          <w:tcPr>
+            <w:tcW w:type="dxa" w:w="1728"/>
+          </w:tcPr>
+          <w:p>
+            <w:r>
+              <w:rPr>
+                <w:sz w:val="19"/>
+              </w:rPr>
+              <w:t>none published</w:t>
+            </w:r>
+          </w:p>
+        </w:tc>
+        <w:tc>
+          <w:tcPr>
+            <w:tcW w:type="dxa" w:w="1728"/>
+          </w:tcPr>
+          <w:p>
+            <w:r>
+              <w:rPr>
+                <w:sz w:val="19"/>
+              </w:rPr>
+              <w:t>03-8318 3000 (main)</w:t>
+            </w:r>
+          </w:p>
+        </w:tc>
+      </w:tr>
+      <w:tr>
+        <w:tc>
+          <w:tcPr>
+            <w:tcW w:type="dxa" w:w="1728"/>
+          </w:tcPr>
+          <w:p>
+            <w:r>
+              <w:rPr>
+                <w:sz w:val="19"/>
+              </w:rPr>
+              <w:t>CyberSecurity Malaysia (MY-05)</w:t>
+            </w:r>
+          </w:p>
+        </w:tc>
+        <w:tc>
+          <w:tcPr>
+            <w:tcW w:type="dxa" w:w="1728"/>
+          </w:tcPr>
+          <w:p>
+            <w:r>
+              <w:rPr>
+                <w:sz w:val="19"/>
+              </w:rPr>
+              <w:t>Wan Roshaimi Wan Abdullah</w:t>
+            </w:r>
+          </w:p>
+        </w:tc>
+        <w:tc>
+          <w:tcPr>
+            <w:tcW w:type="dxa" w:w="1728"/>
+          </w:tcPr>
+          <w:p>
+            <w:r>
+              <w:rPr>
+                <w:sz w:val="19"/>
+              </w:rPr>
+              <w:t>Chief Technology Officer — technical decision seat</w:t>
+            </w:r>
+          </w:p>
+        </w:tc>
+        <w:tc>
+          <w:tcPr>
+            <w:tcW w:type="dxa" w:w="1728"/>
+          </w:tcPr>
+          <w:p>
+            <w:r>
+              <w:rPr>
+                <w:sz w:val="19"/>
+              </w:rPr>
+              <w:t>none published</w:t>
+            </w:r>
+          </w:p>
+        </w:tc>
+        <w:tc>
+          <w:tcPr>
+            <w:tcW w:type="dxa" w:w="1728"/>
+          </w:tcPr>
+          <w:p>
+            <w:r>
+              <w:rPr>
+                <w:sz w:val="19"/>
+              </w:rPr>
+              <w:t>03-8318 3000</w:t>
+            </w:r>
+          </w:p>
+        </w:tc>
+      </w:tr>
+      <w:tr>
+        <w:tc>
+          <w:tcPr>
+            <w:tcW w:type="dxa" w:w="1728"/>
+          </w:tcPr>
+          <w:p>
+            <w:r>
+              <w:rPr>
+                <w:sz w:val="19"/>
+              </w:rPr>
+              <w:t>CSAM / ICRC conference</w:t>
+            </w:r>
+          </w:p>
+        </w:tc>
+        <w:tc>
+          <w:tcPr>
+            <w:tcW w:type="dxa" w:w="1728"/>
+          </w:tcPr>
+          <w:p>
+            <w:r>
+              <w:rPr>
+                <w:sz w:val="19"/>
+              </w:rPr>
+              <w:t>ICRC Secretariat</w:t>
+            </w:r>
+          </w:p>
+        </w:tc>
+        <w:tc>
+          <w:tcPr>
+            <w:tcW w:type="dxa" w:w="1728"/>
+          </w:tcPr>
+          <w:p>
+            <w:r>
+              <w:rPr>
+                <w:sz w:val="19"/>
+              </w:rPr>
+              <w:t>CRC2026 conference organiser</w:t>
+            </w:r>
+          </w:p>
+        </w:tc>
+        <w:tc>
+          <w:tcPr>
+            <w:tcW w:type="dxa" w:w="1728"/>
+          </w:tcPr>
+          <w:p>
+            <w:r>
+              <w:rPr>
+                <w:sz w:val="19"/>
+              </w:rPr>
+              <w:t>icrcsecretariat@csam.my</w:t>
+            </w:r>
+          </w:p>
+        </w:tc>
+        <w:tc>
+          <w:tcPr>
+            <w:tcW w:type="dxa" w:w="1728"/>
+          </w:tcPr>
+          <w:p>
+            <w:r>
+              <w:rPr>
+                <w:sz w:val="19"/>
+              </w:rPr>
+              <w:t>none published</w:t>
+            </w:r>
+          </w:p>
+        </w:tc>
+      </w:tr>
+      <w:tr>
+        <w:tc>
+          <w:tcPr>
+            <w:tcW w:type="dxa" w:w="1728"/>
+          </w:tcPr>
+          <w:p>
+            <w:r>
+              <w:rPr>
+                <w:sz w:val="19"/>
+              </w:rPr>
+              <w:t>CAAM (halo account)</w:t>
+            </w:r>
+          </w:p>
+        </w:tc>
+        <w:tc>
+          <w:tcPr>
+            <w:tcW w:type="dxa" w:w="1728"/>
+          </w:tcPr>
+          <w:p>
+            <w:r>
+              <w:rPr>
+                <w:sz w:val="19"/>
+              </w:rPr>
+              <w:t>Mohd Hazlim bin Hamid</w:t>
+            </w:r>
+          </w:p>
+        </w:tc>
+        <w:tc>
+          <w:tcPr>
+            <w:tcW w:type="dxa" w:w="1728"/>
+          </w:tcPr>
+          <w:p>
+            <w:r>
+              <w:rPr>
+                <w:sz w:val="19"/>
+              </w:rPr>
+              <w:t>Director of Technology &amp; Digitalisation; Key Sponsor of Aras collaboration</w:t>
+            </w:r>
+          </w:p>
+        </w:tc>
+        <w:tc>
+          <w:tcPr>
+            <w:tcW w:type="dxa" w:w="1728"/>
+          </w:tcPr>
+          <w:p>
+            <w:r>
+              <w:rPr>
+                <w:sz w:val="19"/>
+              </w:rPr>
+              <w:t>via Aras account channel (not public)</w:t>
+            </w:r>
+          </w:p>
+        </w:tc>
+        <w:tc>
+          <w:tcPr>
+            <w:tcW w:type="dxa" w:w="1728"/>
+          </w:tcPr>
+          <w:p>
+            <w:r>
+              <w:rPr>
+                <w:sz w:val="19"/>
+              </w:rPr>
+              <w:t>none published</w:t>
+            </w:r>
+          </w:p>
+        </w:tc>
+      </w:tr>
+      <w:tr>
+        <w:tc>
+          <w:tcPr>
+            <w:tcW w:type="dxa" w:w="1728"/>
+          </w:tcPr>
+          <w:p>
+            <w:r>
+              <w:rPr>
+                <w:sz w:val="19"/>
+              </w:rPr>
+              <w:t>Luno Malaysia (MY-06)</w:t>
+            </w:r>
+          </w:p>
+        </w:tc>
+        <w:tc>
+          <w:tcPr>
+            <w:tcW w:type="dxa" w:w="1728"/>
+          </w:tcPr>
+          <w:p>
+            <w:r>
+              <w:rPr>
+                <w:sz w:val="19"/>
+              </w:rPr>
+              <w:t>Scarlett Chai</w:t>
+            </w:r>
+          </w:p>
+        </w:tc>
+        <w:tc>
+          <w:tcPr>
+            <w:tcW w:type="dxa" w:w="1728"/>
+          </w:tcPr>
+          <w:p>
+            <w:r>
+              <w:rPr>
+                <w:sz w:val="19"/>
+              </w:rPr>
+              <w:t>Country Manager, Malaysia</w:t>
+            </w:r>
+          </w:p>
+        </w:tc>
+        <w:tc>
+          <w:tcPr>
+            <w:tcW w:type="dxa" w:w="1728"/>
+          </w:tcPr>
+          <w:p>
+            <w:r>
+              <w:rPr>
+                <w:sz w:val="19"/>
+              </w:rPr>
+              <w:t>none published (support forms: guide.luno.com)</w:t>
+            </w:r>
+          </w:p>
+        </w:tc>
+        <w:tc>
+          <w:tcPr>
+            <w:tcW w:type="dxa" w:w="1728"/>
+          </w:tcPr>
+          <w:p>
+            <w:r>
+              <w:rPr>
+                <w:sz w:val="19"/>
+              </w:rPr>
+              <w:t>none published</w:t>
+            </w:r>
+          </w:p>
+        </w:tc>
+      </w:tr>
+      <w:tr>
+        <w:tc>
+          <w:tcPr>
+            <w:tcW w:type="dxa" w:w="1728"/>
+          </w:tcPr>
+          <w:p>
+            <w:r>
+              <w:rPr>
+                <w:sz w:val="19"/>
+              </w:rPr>
+              <w:t>Luno Malaysia (MY-06)</w:t>
+            </w:r>
+          </w:p>
+        </w:tc>
+        <w:tc>
+          <w:tcPr>
+            <w:tcW w:type="dxa" w:w="1728"/>
+          </w:tcPr>
+          <w:p>
+            <w:r>
+              <w:rPr>
+                <w:sz w:val="19"/>
+              </w:rPr>
+              <w:t>Jeroni Khoo</w:t>
+            </w:r>
+          </w:p>
+        </w:tc>
+        <w:tc>
+          <w:tcPr>
+            <w:tcW w:type="dxa" w:w="1728"/>
+          </w:tcPr>
+          <w:p>
+            <w:r>
+              <w:rPr>
+                <w:sz w:val="19"/>
+              </w:rPr>
+              <w:t>Deputy Country Manager, Malaysia</w:t>
+            </w:r>
+          </w:p>
+        </w:tc>
+        <w:tc>
+          <w:tcPr>
+            <w:tcW w:type="dxa" w:w="1728"/>
+          </w:tcPr>
+          <w:p>
+            <w:r>
+              <w:rPr>
+                <w:sz w:val="19"/>
+              </w:rPr>
+              <w:t>none published</w:t>
+            </w:r>
+          </w:p>
+        </w:tc>
+        <w:tc>
+          <w:tcPr>
+            <w:tcW w:type="dxa" w:w="1728"/>
+          </w:tcPr>
+          <w:p>
+            <w:r>
+              <w:rPr>
+                <w:sz w:val="19"/>
+              </w:rPr>
+              <w:t>none published</w:t>
+            </w:r>
+          </w:p>
+        </w:tc>
+      </w:tr>
+      <w:tr>
+        <w:tc>
+          <w:tcPr>
+            <w:tcW w:type="dxa" w:w="1728"/>
+          </w:tcPr>
+          <w:p>
+            <w:r>
+              <w:rPr>
+                <w:sz w:val="19"/>
+              </w:rPr>
+              <w:t>Luno Global</w:t>
+            </w:r>
+          </w:p>
+        </w:tc>
+        <w:tc>
+          <w:tcPr>
+            <w:tcW w:type="dxa" w:w="1728"/>
+          </w:tcPr>
+          <w:p>
+            <w:r>
+              <w:rPr>
+                <w:sz w:val="19"/>
+              </w:rPr>
+              <w:t>Johan Hetzel (CAMS)</w:t>
+            </w:r>
+          </w:p>
+        </w:tc>
+        <w:tc>
+          <w:tcPr>
+            <w:tcW w:type="dxa" w:w="1728"/>
+          </w:tcPr>
+          <w:p>
+            <w:r>
+              <w:rPr>
+                <w:sz w:val="19"/>
+              </w:rPr>
+              <w:t>Group Head of Compliance &amp; AFC (Crypto)</w:t>
+            </w:r>
+          </w:p>
+        </w:tc>
+        <w:tc>
+          <w:tcPr>
+            <w:tcW w:type="dxa" w:w="1728"/>
+          </w:tcPr>
+          <w:p>
+            <w:r>
+              <w:rPr>
+                <w:sz w:val="19"/>
+              </w:rPr>
+              <w:t>none published</w:t>
+            </w:r>
+          </w:p>
+        </w:tc>
+        <w:tc>
+          <w:tcPr>
+            <w:tcW w:type="dxa" w:w="1728"/>
+          </w:tcPr>
+          <w:p>
+            <w:r>
+              <w:rPr>
+                <w:sz w:val="19"/>
+              </w:rPr>
+              <w:t>none published</w:t>
+            </w:r>
+          </w:p>
+        </w:tc>
+      </w:tr>
+      <w:tr>
+        <w:tc>
+          <w:tcPr>
+            <w:tcW w:type="dxa" w:w="1728"/>
+          </w:tcPr>
+          <w:p>
+            <w:r>
+              <w:rPr>
+                <w:sz w:val="19"/>
+              </w:rPr>
+              <w:t>MX Global (MY-07)</w:t>
+            </w:r>
+          </w:p>
+        </w:tc>
+        <w:tc>
+          <w:tcPr>
+            <w:tcW w:type="dxa" w:w="1728"/>
+          </w:tcPr>
+          <w:p>
+            <w:r>
+              <w:rPr>
+                <w:sz w:val="19"/>
+              </w:rPr>
+              <w:t>Datuk Fadzli Shah bin Sheikh Fadzir</w:t>
+            </w:r>
+          </w:p>
+        </w:tc>
+        <w:tc>
+          <w:tcPr>
+            <w:tcW w:type="dxa" w:w="1728"/>
+          </w:tcPr>
+          <w:p>
+            <w:r>
+              <w:rPr>
+                <w:sz w:val="19"/>
+              </w:rPr>
+              <w:t>Group CEO [tenure stale-flagged: last confirmed Apr-25 — verify before outreach]</w:t>
+            </w:r>
+          </w:p>
+        </w:tc>
+        <w:tc>
+          <w:tcPr>
+            <w:tcW w:type="dxa" w:w="1728"/>
+          </w:tcPr>
+          <w:p>
+            <w:r>
+              <w:rPr>
+                <w:sz w:val="19"/>
+              </w:rPr>
+              <w:t>none published (contact form mxglobal.com)</w:t>
+            </w:r>
+          </w:p>
+        </w:tc>
+        <w:tc>
+          <w:tcPr>
+            <w:tcW w:type="dxa" w:w="1728"/>
+          </w:tcPr>
+          <w:p>
+            <w:r>
+              <w:rPr>
+                <w:sz w:val="19"/>
+              </w:rPr>
+              <w:t>none published</w:t>
+            </w:r>
+          </w:p>
+        </w:tc>
+      </w:tr>
+      <w:tr>
+        <w:tc>
+          <w:tcPr>
+            <w:tcW w:type="dxa" w:w="1728"/>
+          </w:tcPr>
+          <w:p>
+            <w:r>
+              <w:rPr>
+                <w:sz w:val="19"/>
+              </w:rPr>
+              <w:t>TNG Digital (MY-09)</w:t>
+            </w:r>
+          </w:p>
+        </w:tc>
+        <w:tc>
+          <w:tcPr>
+            <w:tcW w:type="dxa" w:w="1728"/>
+          </w:tcPr>
+          <w:p>
+            <w:r>
+              <w:rPr>
+                <w:sz w:val="19"/>
+              </w:rPr>
+              <w:t>Head of Financial Crime Compliance (SEAT OPEN — hire lands into stack decision)</w:t>
+            </w:r>
+          </w:p>
+        </w:tc>
+        <w:tc>
+          <w:tcPr>
+            <w:tcW w:type="dxa" w:w="1728"/>
+          </w:tcPr>
+          <w:p>
+            <w:r>
+              <w:rPr>
+                <w:sz w:val="19"/>
+              </w:rPr>
+              <w:t>Heads of Financial Crime Compliance</w:t>
+            </w:r>
+          </w:p>
+        </w:tc>
+        <w:tc>
+          <w:tcPr>
+            <w:tcW w:type="dxa" w:w="1728"/>
+          </w:tcPr>
+          <w:p>
+            <w:r>
+              <w:rPr>
+                <w:sz w:val="19"/>
+              </w:rPr>
+              <w:t>none — position being recruited (posted 23-Sep-26)</w:t>
+            </w:r>
+          </w:p>
+        </w:tc>
+        <w:tc>
+          <w:tcPr>
+            <w:tcW w:type="dxa" w:w="1728"/>
+          </w:tcPr>
+          <w:p>
+            <w:r>
+              <w:rPr>
+                <w:sz w:val="19"/>
+              </w:rPr>
+              <w:t>+603-5022 3888 (corporate HQ, Bangsar South)</w:t>
+            </w:r>
+          </w:p>
+        </w:tc>
+      </w:tr>
+      <w:tr>
+        <w:tc>
+          <w:tcPr>
+            <w:tcW w:type="dxa" w:w="1728"/>
+          </w:tcPr>
+          <w:p>
+            <w:r>
+              <w:rPr>
+                <w:sz w:val="19"/>
+              </w:rPr>
+              <w:t>TNG Digital (MY-09)</w:t>
+            </w:r>
+          </w:p>
+        </w:tc>
+        <w:tc>
+          <w:tcPr>
+            <w:tcW w:type="dxa" w:w="1728"/>
+          </w:tcPr>
+          <w:p>
+            <w:r>
+              <w:rPr>
+                <w:sz w:val="19"/>
+              </w:rPr>
+              <w:t>Alan Ni</w:t>
+            </w:r>
+          </w:p>
+        </w:tc>
+        <w:tc>
+          <w:tcPr>
+            <w:tcW w:type="dxa" w:w="1728"/>
+          </w:tcPr>
+          <w:p>
+            <w:r>
+              <w:rPr>
+                <w:sz w:val="19"/>
+              </w:rPr>
+              <w:t>Chief Executive Officer (risk-and-fraud career founder)</w:t>
+            </w:r>
+          </w:p>
+        </w:tc>
+        <w:tc>
+          <w:tcPr>
+            <w:tcW w:type="dxa" w:w="1728"/>
+          </w:tcPr>
+          <w:p>
+            <w:r>
+              <w:rPr>
+                <w:sz w:val="19"/>
+              </w:rPr>
+              <w:t>none published</w:t>
+            </w:r>
+          </w:p>
+        </w:tc>
+        <w:tc>
+          <w:tcPr>
+            <w:tcW w:type="dxa" w:w="1728"/>
+          </w:tcPr>
+          <w:p>
+            <w:r>
+              <w:rPr>
+                <w:sz w:val="19"/>
+              </w:rPr>
+              <w:t>+603-5022 3888</w:t>
+            </w:r>
+          </w:p>
+        </w:tc>
+      </w:tr>
+      <w:tr>
+        <w:tc>
+          <w:tcPr>
+            <w:tcW w:type="dxa" w:w="1728"/>
+          </w:tcPr>
+          <w:p>
+            <w:r>
+              <w:rPr>
+                <w:sz w:val="19"/>
+              </w:rPr>
+              <w:t>Maybank Group (MY-12)</w:t>
+            </w:r>
+          </w:p>
+        </w:tc>
+        <w:tc>
+          <w:tcPr>
+            <w:tcW w:type="dxa" w:w="1728"/>
+          </w:tcPr>
+          <w:p>
+            <w:r>
+              <w:rPr>
+                <w:sz w:val="19"/>
+              </w:rPr>
+              <w:t>Yiow Inn Sann</w:t>
+            </w:r>
+          </w:p>
+        </w:tc>
+        <w:tc>
+          <w:tcPr>
+            <w:tcW w:type="dxa" w:w="1728"/>
+          </w:tcPr>
+          <w:p>
+            <w:r>
+              <w:rPr>
+                <w:sz w:val="19"/>
+              </w:rPr>
+              <w:t>Group Chief Compliance Officer</w:t>
+            </w:r>
+          </w:p>
+        </w:tc>
+        <w:tc>
+          <w:tcPr>
+            <w:tcW w:type="dxa" w:w="1728"/>
+          </w:tcPr>
+          <w:p>
+            <w:r>
+              <w:rPr>
+                <w:sz w:val="19"/>
+              </w:rPr>
+              <w:t>eprochelpdesk@maybank.com.my (published vendor/procurement helpdesk)</w:t>
+            </w:r>
+          </w:p>
+        </w:tc>
+        <w:tc>
+          <w:tcPr>
+            <w:tcW w:type="dxa" w:w="1728"/>
+          </w:tcPr>
+          <w:p>
+            <w:r>
+              <w:rPr>
+                <w:sz w:val="19"/>
+              </w:rPr>
+              <w:t>none published</w:t>
+            </w:r>
+          </w:p>
+        </w:tc>
+      </w:tr>
+      <w:tr>
+        <w:tc>
+          <w:tcPr>
+            <w:tcW w:type="dxa" w:w="1728"/>
+          </w:tcPr>
+          <w:p>
+            <w:r>
+              <w:rPr>
+                <w:sz w:val="19"/>
+              </w:rPr>
+              <w:t>Maybank Group (MY-12)</w:t>
+            </w:r>
+          </w:p>
+        </w:tc>
+        <w:tc>
+          <w:tcPr>
+            <w:tcW w:type="dxa" w:w="1728"/>
+          </w:tcPr>
+          <w:p>
+            <w:r>
+              <w:rPr>
+                <w:sz w:val="19"/>
+              </w:rPr>
+              <w:t>Shamsher Singh</w:t>
+            </w:r>
+          </w:p>
+        </w:tc>
+        <w:tc>
+          <w:tcPr>
+            <w:tcW w:type="dxa" w:w="1728"/>
+          </w:tcPr>
+          <w:p>
+            <w:r>
+              <w:rPr>
+                <w:sz w:val="19"/>
+              </w:rPr>
+              <w:t>Head of Regional Compliance</w:t>
+            </w:r>
+          </w:p>
+        </w:tc>
+        <w:tc>
+          <w:tcPr>
+            <w:tcW w:type="dxa" w:w="1728"/>
+          </w:tcPr>
+          <w:p>
+            <w:r>
+              <w:rPr>
+                <w:sz w:val="19"/>
+              </w:rPr>
+              <w:t>via eprochelpdesk intake</w:t>
+            </w:r>
+          </w:p>
+        </w:tc>
+        <w:tc>
+          <w:tcPr>
+            <w:tcW w:type="dxa" w:w="1728"/>
+          </w:tcPr>
+          <w:p>
+            <w:r>
+              <w:rPr>
+                <w:sz w:val="19"/>
+              </w:rPr>
+              <w:t>none published</w:t>
+            </w:r>
+          </w:p>
+        </w:tc>
+      </w:tr>
+      <w:tr>
+        <w:tc>
+          <w:tcPr>
+            <w:tcW w:type="dxa" w:w="1728"/>
+          </w:tcPr>
+          <w:p>
+            <w:r>
+              <w:rPr>
+                <w:sz w:val="19"/>
+              </w:rPr>
+              <w:t>CelcomDigi (MY-10)</w:t>
+            </w:r>
+          </w:p>
+        </w:tc>
+        <w:tc>
+          <w:tcPr>
+            <w:tcW w:type="dxa" w:w="1728"/>
+          </w:tcPr>
+          <w:p>
+            <w:r>
+              <w:rPr>
+                <w:sz w:val="19"/>
+              </w:rPr>
+              <w:t>Albern Murty</w:t>
+            </w:r>
+          </w:p>
+        </w:tc>
+        <w:tc>
+          <w:tcPr>
+            <w:tcW w:type="dxa" w:w="1728"/>
+          </w:tcPr>
+          <w:p>
+            <w:r>
+              <w:rPr>
+                <w:sz w:val="19"/>
+              </w:rPr>
+              <w:t>Group CEO (eff. 10-Feb-26)</w:t>
+            </w:r>
+          </w:p>
+        </w:tc>
+        <w:tc>
+          <w:tcPr>
+            <w:tcW w:type="dxa" w:w="1728"/>
+          </w:tcPr>
+          <w:p>
+            <w:r>
+              <w:rPr>
+                <w:sz w:val="19"/>
+              </w:rPr>
+              <w:t>none published</w:t>
+            </w:r>
+          </w:p>
+        </w:tc>
+        <w:tc>
+          <w:tcPr>
+            <w:tcW w:type="dxa" w:w="1728"/>
+          </w:tcPr>
+          <w:p>
+            <w:r>
+              <w:rPr>
+                <w:sz w:val="19"/>
+              </w:rPr>
+              <w:t>none published</w:t>
+            </w:r>
+          </w:p>
+        </w:tc>
+      </w:tr>
+      <w:tr>
+        <w:tc>
+          <w:tcPr>
+            <w:tcW w:type="dxa" w:w="1728"/>
+          </w:tcPr>
+          <w:p>
+            <w:r>
+              <w:rPr>
+                <w:sz w:val="19"/>
+              </w:rPr>
+              <w:t>Axiata (CelcomDigi parent)</w:t>
+            </w:r>
+          </w:p>
+        </w:tc>
+        <w:tc>
+          <w:tcPr>
+            <w:tcW w:type="dxa" w:w="1728"/>
+          </w:tcPr>
+          <w:p>
+            <w:r>
+              <w:rPr>
+                <w:sz w:val="19"/>
+              </w:rPr>
+              <w:t>Suresh Sankaran Srinivasan</w:t>
+            </w:r>
+          </w:p>
+        </w:tc>
+        <w:tc>
+          <w:tcPr>
+            <w:tcW w:type="dxa" w:w="1728"/>
+          </w:tcPr>
+          <w:p>
+            <w:r>
+              <w:rPr>
+                <w:sz w:val="19"/>
+              </w:rPr>
+              <w:t>Group Head of Cyber Security, Axiata Group</w:t>
+            </w:r>
+          </w:p>
+        </w:tc>
+        <w:tc>
+          <w:tcPr>
+            <w:tcW w:type="dxa" w:w="1728"/>
+          </w:tcPr>
+          <w:p>
+            <w:r>
+              <w:rPr>
+                <w:sz w:val="19"/>
+              </w:rPr>
+              <w:t>none published</w:t>
+            </w:r>
+          </w:p>
+        </w:tc>
+        <w:tc>
+          <w:tcPr>
+            <w:tcW w:type="dxa" w:w="1728"/>
+          </w:tcPr>
+          <w:p>
+            <w:r>
+              <w:rPr>
+                <w:sz w:val="19"/>
+              </w:rPr>
+              <w:t>none published</w:t>
+            </w:r>
+          </w:p>
+        </w:tc>
+      </w:tr>
+      <w:tr>
+        <w:tc>
+          <w:tcPr>
+            <w:tcW w:type="dxa" w:w="1728"/>
+          </w:tcPr>
+          <w:p>
+            <w:r>
+              <w:rPr>
+                <w:sz w:val="19"/>
+              </w:rPr>
+              <w:t>Bybit — KL AML hub (MY-13)</w:t>
+            </w:r>
+          </w:p>
+        </w:tc>
+        <w:tc>
+          <w:tcPr>
+            <w:tcW w:type="dxa" w:w="1728"/>
+          </w:tcPr>
+          <w:p>
+            <w:r>
+              <w:rPr>
+                <w:sz w:val="19"/>
+              </w:rPr>
+              <w:t>Head of Compliance / KL AML desk (6 roles open 22-Sep–9-Oct)</w:t>
+            </w:r>
+          </w:p>
+        </w:tc>
+        <w:tc>
+          <w:tcPr>
+            <w:tcW w:type="dxa" w:w="1728"/>
+          </w:tcPr>
+          <w:p>
+            <w:r>
+              <w:rPr>
+                <w:sz w:val="19"/>
+              </w:rPr>
+              <w:t>Sr AML Specialists (TM/KYB/Investigations/Name Screening &amp; Travel Rule) + Lead</w:t>
+            </w:r>
+          </w:p>
+        </w:tc>
+        <w:tc>
+          <w:tcPr>
+            <w:tcW w:type="dxa" w:w="1728"/>
+          </w:tcPr>
+          <w:p>
+            <w:r>
+              <w:rPr>
+                <w:sz w:val="19"/>
+              </w:rPr>
+              <w:t>none published (support cases only)</w:t>
+            </w:r>
+          </w:p>
+        </w:tc>
+        <w:tc>
+          <w:tcPr>
+            <w:tcW w:type="dxa" w:w="1728"/>
+          </w:tcPr>
+          <w:p>
+            <w:r>
+              <w:rPr>
+                <w:sz w:val="19"/>
+              </w:rPr>
+              <w:t>none published</w:t>
+            </w:r>
+          </w:p>
+        </w:tc>
+      </w:tr>
+      <w:tr>
+        <w:tc>
+          <w:tcPr>
+            <w:tcW w:type="dxa" w:w="1728"/>
+          </w:tcPr>
+          <w:p>
+            <w:r>
+              <w:rPr>
+                <w:sz w:val="19"/>
+              </w:rPr>
+              <w:t>Reap (MY-17)</w:t>
+            </w:r>
+          </w:p>
+        </w:tc>
+        <w:tc>
+          <w:tcPr>
+            <w:tcW w:type="dxa" w:w="1728"/>
+          </w:tcPr>
+          <w:p>
+            <w:r>
+              <w:rPr>
+                <w:sz w:val="19"/>
+              </w:rPr>
+              <w:t>FinCrime Operations Lead (hiring)</w:t>
+            </w:r>
+          </w:p>
+        </w:tc>
+        <w:tc>
+          <w:tcPr>
+            <w:tcW w:type="dxa" w:w="1728"/>
+          </w:tcPr>
+          <w:p>
+            <w:r>
+              <w:rPr>
+                <w:sz w:val="19"/>
+              </w:rPr>
+              <w:t>Lead, Transaction Monitoring — FCA</w:t>
+            </w:r>
+          </w:p>
+        </w:tc>
+        <w:tc>
+          <w:tcPr>
+            <w:tcW w:type="dxa" w:w="1728"/>
+          </w:tcPr>
+          <w:p>
+            <w:r>
+              <w:rPr>
+                <w:sz w:val="19"/>
+              </w:rPr>
+              <w:t>none published</w:t>
+            </w:r>
+          </w:p>
+        </w:tc>
+        <w:tc>
+          <w:tcPr>
+            <w:tcW w:type="dxa" w:w="1728"/>
+          </w:tcPr>
+          <w:p>
+            <w:r>
+              <w:rPr>
+                <w:sz w:val="19"/>
+              </w:rPr>
+              <w:t>none published</w:t>
+            </w:r>
+          </w:p>
+        </w:tc>
+      </w:tr>
+      <w:tr>
+        <w:tc>
+          <w:tcPr>
+            <w:tcW w:type="dxa" w:w="1728"/>
+          </w:tcPr>
+          <w:p>
+            <w:r>
+              <w:rPr>
+                <w:sz w:val="19"/>
+              </w:rPr>
+              <w:t>Ryt Bank (MY-19)</w:t>
+            </w:r>
+          </w:p>
+        </w:tc>
+        <w:tc>
+          <w:tcPr>
+            <w:tcW w:type="dxa" w:w="1728"/>
+          </w:tcPr>
+          <w:p>
+            <w:r>
+              <w:rPr>
+                <w:sz w:val="19"/>
+              </w:rPr>
+              <w:t>Fraud &amp; Financial Crime Risk Lead (hiring)</w:t>
+            </w:r>
+          </w:p>
+        </w:tc>
+        <w:tc>
+          <w:tcPr>
+            <w:tcW w:type="dxa" w:w="1728"/>
+          </w:tcPr>
+          <w:p>
+            <w:r>
+              <w:rPr>
+                <w:sz w:val="19"/>
+              </w:rPr>
+              <w:t>Fraud &amp; FC Risk Lead</w:t>
+            </w:r>
+          </w:p>
+        </w:tc>
+        <w:tc>
+          <w:tcPr>
+            <w:tcW w:type="dxa" w:w="1728"/>
+          </w:tcPr>
+          <w:p>
+            <w:r>
+              <w:rPr>
+                <w:sz w:val="19"/>
+              </w:rPr>
+              <w:t>none published</w:t>
+            </w:r>
+          </w:p>
+        </w:tc>
+        <w:tc>
+          <w:tcPr>
+            <w:tcW w:type="dxa" w:w="1728"/>
+          </w:tcPr>
+          <w:p>
+            <w:r>
+              <w:rPr>
+                <w:sz w:val="19"/>
+              </w:rPr>
+              <w:t>none published</w:t>
+            </w:r>
+          </w:p>
+        </w:tc>
+      </w:tr>
+      <w:tr>
+        <w:tc>
+          <w:tcPr>
+            <w:tcW w:type="dxa" w:w="1728"/>
+          </w:tcPr>
+          <w:p>
+            <w:r>
+              <w:rPr>
+                <w:sz w:val="19"/>
+              </w:rPr>
+              <w:t>RedotPay (MY-18)</w:t>
+            </w:r>
+          </w:p>
+        </w:tc>
+        <w:tc>
+          <w:tcPr>
+            <w:tcW w:type="dxa" w:w="1728"/>
+          </w:tcPr>
+          <w:p>
+            <w:r>
+              <w:rPr>
+                <w:sz w:val="19"/>
+              </w:rPr>
+              <w:t>TM Specialist Web3 (hiring); compliance team filing own SARs</w:t>
+            </w:r>
+          </w:p>
+        </w:tc>
+        <w:tc>
+          <w:tcPr>
+            <w:tcW w:type="dxa" w:w="1728"/>
+          </w:tcPr>
+          <w:p>
+            <w:r>
+              <w:rPr>
+                <w:sz w:val="19"/>
+              </w:rPr>
+              <w:t>Transaction Monitoring Specialist</w:t>
+            </w:r>
+          </w:p>
+        </w:tc>
+        <w:tc>
+          <w:tcPr>
+            <w:tcW w:type="dxa" w:w="1728"/>
+          </w:tcPr>
+          <w:p>
+            <w:r>
+              <w:rPr>
+                <w:sz w:val="19"/>
+              </w:rPr>
+              <w:t>none published</w:t>
+            </w:r>
+          </w:p>
+        </w:tc>
+        <w:tc>
+          <w:tcPr>
+            <w:tcW w:type="dxa" w:w="1728"/>
+          </w:tcPr>
+          <w:p>
+            <w:r>
+              <w:rPr>
+                <w:sz w:val="19"/>
+              </w:rPr>
+              <w:t>none published</w:t>
+            </w:r>
+          </w:p>
+        </w:tc>
+      </w:tr>
+      <w:tr>
+        <w:tc>
+          <w:tcPr>
+            <w:tcW w:type="dxa" w:w="1728"/>
+          </w:tcPr>
+          <w:p>
+            <w:r>
+              <w:rPr>
+                <w:sz w:val="19"/>
+              </w:rPr>
+              <w:t>First Digital FDUSD (MY-14)</w:t>
+            </w:r>
+          </w:p>
+        </w:tc>
+        <w:tc>
+          <w:tcPr>
+            <w:tcW w:type="dxa" w:w="1728"/>
+          </w:tcPr>
+          <w:p>
+            <w:r>
+              <w:rPr>
+                <w:sz w:val="19"/>
+              </w:rPr>
+              <w:t>Compliance Operations (hiring)</w:t>
+            </w:r>
+          </w:p>
+        </w:tc>
+        <w:tc>
+          <w:tcPr>
+            <w:tcW w:type="dxa" w:w="1728"/>
+          </w:tcPr>
+          <w:p>
+            <w:r>
+              <w:rPr>
+                <w:sz w:val="19"/>
+              </w:rPr>
+              <w:t>Compliance Operations Analyst</w:t>
+            </w:r>
+          </w:p>
+        </w:tc>
+        <w:tc>
+          <w:tcPr>
+            <w:tcW w:type="dxa" w:w="1728"/>
+          </w:tcPr>
+          <w:p>
+            <w:r>
+              <w:rPr>
+                <w:sz w:val="19"/>
+              </w:rPr>
+              <w:t>none published</w:t>
+            </w:r>
+          </w:p>
+        </w:tc>
+        <w:tc>
+          <w:tcPr>
+            <w:tcW w:type="dxa" w:w="1728"/>
+          </w:tcPr>
+          <w:p>
+            <w:r>
+              <w:rPr>
+                <w:sz w:val="19"/>
+              </w:rPr>
+              <w:t>none published</w:t>
+            </w:r>
+          </w:p>
+        </w:tc>
+      </w:tr>
+      <w:tr>
+        <w:tc>
+          <w:tcPr>
+            <w:tcW w:type="dxa" w:w="1728"/>
+          </w:tcPr>
+          <w:p>
+            <w:r>
+              <w:rPr>
+                <w:sz w:val="19"/>
+              </w:rPr>
+              <w:t>Gate MY (MY-20)</w:t>
+            </w:r>
+          </w:p>
+        </w:tc>
+        <w:tc>
+          <w:tcPr>
+            <w:tcW w:type="dxa" w:w="1728"/>
+          </w:tcPr>
+          <w:p>
+            <w:r>
+              <w:rPr>
+                <w:sz w:val="19"/>
+              </w:rPr>
+              <w:t>Head of Compliance Product (hiring)</w:t>
+            </w:r>
+          </w:p>
+        </w:tc>
+        <w:tc>
+          <w:tcPr>
+            <w:tcW w:type="dxa" w:w="1728"/>
+          </w:tcPr>
+          <w:p>
+            <w:r>
+              <w:rPr>
+                <w:sz w:val="19"/>
+              </w:rPr>
+              <w:t>Sr PM AML &amp; FCC + TM&amp;KYC Team Lead</w:t>
+            </w:r>
+          </w:p>
+        </w:tc>
+        <w:tc>
+          <w:tcPr>
+            <w:tcW w:type="dxa" w:w="1728"/>
+          </w:tcPr>
+          <w:p>
+            <w:r>
+              <w:rPr>
+                <w:sz w:val="19"/>
+              </w:rPr>
+              <w:t>none published</w:t>
+            </w:r>
+          </w:p>
+        </w:tc>
+        <w:tc>
+          <w:tcPr>
+            <w:tcW w:type="dxa" w:w="1728"/>
+          </w:tcPr>
+          <w:p>
+            <w:r>
+              <w:rPr>
+                <w:sz w:val="19"/>
+              </w:rPr>
+              <w:t>none published</w:t>
+            </w:r>
+          </w:p>
+        </w:tc>
+      </w:tr>
+      <w:tr>
+        <w:tc>
+          <w:tcPr>
+            <w:tcW w:type="dxa" w:w="1728"/>
+          </w:tcPr>
+          <w:p>
+            <w:r>
+              <w:rPr>
+                <w:sz w:val="19"/>
+              </w:rPr>
+              <w:t>MEXC (MEA AE-26)</w:t>
+            </w:r>
+          </w:p>
+        </w:tc>
+        <w:tc>
+          <w:tcPr>
+            <w:tcW w:type="dxa" w:w="1728"/>
+          </w:tcPr>
+          <w:p>
+            <w:r>
+              <w:rPr>
+                <w:sz w:val="19"/>
+              </w:rPr>
+              <w:t>VARA-remediation/compliance team (leadership public-thin)</w:t>
+            </w:r>
+          </w:p>
+        </w:tc>
+        <w:tc>
+          <w:tcPr>
+            <w:tcW w:type="dxa" w:w="1728"/>
+          </w:tcPr>
+          <w:p>
+            <w:r>
+              <w:rPr>
+                <w:sz w:val="19"/>
+              </w:rPr>
+              <w:t>Compliance/monitoring build for VARA licensing</w:t>
+            </w:r>
+          </w:p>
+        </w:tc>
+        <w:tc>
+          <w:tcPr>
+            <w:tcW w:type="dxa" w:w="1728"/>
+          </w:tcPr>
+          <w:p>
+            <w:r>
+              <w:rPr>
+                <w:sz w:val="19"/>
+              </w:rPr>
+              <w:t>none published</w:t>
+            </w:r>
+          </w:p>
+        </w:tc>
+        <w:tc>
+          <w:tcPr>
+            <w:tcW w:type="dxa" w:w="1728"/>
+          </w:tcPr>
+          <w:p>
+            <w:r>
+              <w:rPr>
+                <w:sz w:val="19"/>
+              </w:rPr>
+              <w:t>none published</w:t>
+            </w:r>
+          </w:p>
+        </w:tc>
+      </w:tr>
+      <w:tr>
+        <w:tc>
+          <w:tcPr>
+            <w:tcW w:type="dxa" w:w="1728"/>
+          </w:tcPr>
+          <w:p>
+            <w:r>
+              <w:rPr>
+                <w:sz w:val="19"/>
+              </w:rPr>
+              <w:t>StraitsX / Monee (MY-15)</w:t>
+            </w:r>
+          </w:p>
+        </w:tc>
+        <w:tc>
+          <w:tcPr>
+            <w:tcW w:type="dxa" w:w="1728"/>
+          </w:tcPr>
+          <w:p>
+            <w:r>
+              <w:rPr>
+                <w:sz w:val="19"/>
+              </w:rPr>
+              <w:t>AML Agent + OTC Sales Mgr (hiring pair)</w:t>
+            </w:r>
+          </w:p>
+        </w:tc>
+        <w:tc>
+          <w:tcPr>
+            <w:tcW w:type="dxa" w:w="1728"/>
+          </w:tcPr>
+          <w:p>
+            <w:r>
+              <w:rPr>
+                <w:sz w:val="19"/>
+              </w:rPr>
+              <w:t>AML / institutional OTC</w:t>
+            </w:r>
+          </w:p>
+        </w:tc>
+        <w:tc>
+          <w:tcPr>
+            <w:tcW w:type="dxa" w:w="1728"/>
+          </w:tcPr>
+          <w:p>
+            <w:r>
+              <w:rPr>
+                <w:sz w:val="19"/>
+              </w:rPr>
+              <w:t>none published</w:t>
+            </w:r>
+          </w:p>
+        </w:tc>
+        <w:tc>
+          <w:tcPr>
+            <w:tcW w:type="dxa" w:w="1728"/>
+          </w:tcPr>
+          <w:p>
+            <w:r>
+              <w:rPr>
+                <w:sz w:val="19"/>
+              </w:rPr>
+              <w:t>none published</w:t>
+            </w:r>
+          </w:p>
+        </w:tc>
+      </w:tr>
+      <w:tr>
+        <w:tc>
+          <w:tcPr>
+            <w:tcW w:type="dxa" w:w="1728"/>
+          </w:tcPr>
+          <w:p>
+            <w:r>
+              <w:rPr>
+                <w:sz w:val="19"/>
+              </w:rPr>
+              <w:t>Razer (MY-16)</w:t>
+            </w:r>
+          </w:p>
+        </w:tc>
+        <w:tc>
+          <w:tcPr>
+            <w:tcW w:type="dxa" w:w="1728"/>
+          </w:tcPr>
+          <w:p>
+            <w:r>
+              <w:rPr>
+                <w:sz w:val="19"/>
+              </w:rPr>
+              <w:t>Fraud &amp; Transaction Monitoring Specialist (hiring)</w:t>
+            </w:r>
+          </w:p>
+        </w:tc>
+        <w:tc>
+          <w:tcPr>
+            <w:tcW w:type="dxa" w:w="1728"/>
+          </w:tcPr>
+          <w:p>
+            <w:r>
+              <w:rPr>
+                <w:sz w:val="19"/>
+              </w:rPr>
+              <w:t>Fraud &amp; TM Specialist</w:t>
+            </w:r>
+          </w:p>
+        </w:tc>
+        <w:tc>
+          <w:tcPr>
+            <w:tcW w:type="dxa" w:w="1728"/>
+          </w:tcPr>
+          <w:p>
+            <w:r>
+              <w:rPr>
+                <w:sz w:val="19"/>
+              </w:rPr>
+              <w:t>none published</w:t>
+            </w:r>
+          </w:p>
+        </w:tc>
+        <w:tc>
+          <w:tcPr>
+            <w:tcW w:type="dxa" w:w="1728"/>
+          </w:tcPr>
+          <w:p>
+            <w:r>
+              <w:rPr>
+                <w:sz w:val="19"/>
+              </w:rPr>
+              <w:t>none published</w:t>
+            </w:r>
+          </w:p>
+        </w:tc>
+      </w:tr>
+      <w:tr>
+        <w:tc>
+          <w:tcPr>
+            <w:tcW w:type="dxa" w:w="1728"/>
+          </w:tcPr>
+          <w:p>
+            <w:r>
+              <w:rPr>
+                <w:sz w:val="19"/>
+              </w:rPr>
+              <w:t>Tokenize/KDX (MY-08)</w:t>
+            </w:r>
+          </w:p>
+        </w:tc>
+        <w:tc>
+          <w:tcPr>
+            <w:tcW w:type="dxa" w:w="1728"/>
+          </w:tcPr>
+          <w:p>
+            <w:r>
+              <w:rPr>
+                <w:sz w:val="19"/>
+              </w:rPr>
+              <w:t>(was: Hong Qi Yu founder)</w:t>
+            </w:r>
+          </w:p>
+        </w:tc>
+        <w:tc>
+          <w:tcPr>
+            <w:tcW w:type="dxa" w:w="1728"/>
+          </w:tcPr>
+          <w:p>
+            <w:r>
+              <w:rPr>
+                <w:sz w:val="19"/>
+              </w:rPr>
+              <w:t>—</w:t>
+            </w:r>
+          </w:p>
+        </w:tc>
+        <w:tc>
+          <w:tcPr>
+            <w:tcW w:type="dxa" w:w="1728"/>
+          </w:tcPr>
+          <w:p>
+            <w:r>
+              <w:rPr>
+                <w:sz w:val="19"/>
+              </w:rPr>
+              <w:t>—</w:t>
+            </w:r>
+          </w:p>
+        </w:tc>
+        <w:tc>
+          <w:tcPr>
+            <w:tcW w:type="dxa" w:w="1728"/>
+          </w:tcPr>
+          <w:p>
+            <w:r>
+              <w:rPr>
+                <w:sz w:val="19"/>
+              </w:rPr>
+              <w:t>—</w:t>
+            </w:r>
+          </w:p>
+        </w:tc>
+      </w:tr>
+      <w:tr>
+        <w:tc>
+          <w:tcPr>
+            <w:tcW w:type="dxa" w:w="1728"/>
+          </w:tcPr>
+          <w:p>
+            <w:r>
+              <w:rPr>
+                <w:sz w:val="19"/>
+              </w:rPr>
+              <w:t>Zetrix MY (MY-11)</w:t>
+            </w:r>
+          </w:p>
+        </w:tc>
+        <w:tc>
+          <w:tcPr>
+            <w:tcW w:type="dxa" w:w="1728"/>
+          </w:tcPr>
+          <w:p>
+            <w:r>
+              <w:rPr>
+                <w:sz w:val="19"/>
+              </w:rPr>
+              <w:t>Irsyad Saidin (register contact); TS Wong co-founder</w:t>
+            </w:r>
+          </w:p>
+        </w:tc>
+        <w:tc>
+          <w:tcPr>
+            <w:tcW w:type="dxa" w:w="1728"/>
+          </w:tcPr>
+          <w:p>
+            <w:r>
+              <w:rPr>
+                <w:sz w:val="19"/>
+              </w:rPr>
+              <w:t>—</w:t>
+            </w:r>
+          </w:p>
+        </w:tc>
+        <w:tc>
+          <w:tcPr>
+            <w:tcW w:type="dxa" w:w="1728"/>
+          </w:tcPr>
+          <w:p>
+            <w:r>
+              <w:rPr>
+                <w:sz w:val="19"/>
+              </w:rPr>
+              <w:t>via register thread</w:t>
+            </w:r>
+          </w:p>
+        </w:tc>
+        <w:tc>
+          <w:tcPr>
+            <w:tcW w:type="dxa" w:w="1728"/>
+          </w:tcPr>
+          <w:p>
+            <w:r>
+              <w:rPr>
+                <w:sz w:val="19"/>
+              </w:rPr>
+              <w:t>—</w:t>
+            </w:r>
+          </w:p>
+        </w:tc>
+      </w:tr>
+    </w:tbl>
+    <w:p/>
+    <w:p>
+      <w:r>
+        <w:t>_"none published" = genuinely not public (support forms or Aras/warm channels are the route — recorded honestly, not guessed). Positions marked (hiring) = seat being recruited right now; that IS the buying signal. Full sourcing per row in CONTACTS.csv._</w:t>
       </w:r>
     </w:p>
     <w:p>

</xml_diff>

<commit_message>
update(JSJK): confirmed attendee list (8 officers; ACP Zambri = crypto-crime/forensic-accounting division head); Aqila rank closed ASP; battlemap rebuilt
</commit_message>
<xml_diff>
--- a/roster/MALAYSIA-BATTLEMAP.docx
+++ b/roster/MALAYSIA-BATTLEMAP.docx
@@ -12,7 +12,7 @@
     </w:p>
     <w:p>
       <w:r>
-        <w:t>_Compiled 2026-10-10 · Sources: dated, click-verified OSINT (postings APIs, procurement pages, parliamentary records, official pages, reputable press 2+ corroborations). Internal use — strip contact table before external circulation._</w:t>
+        <w:t>_Compiled 2026-10-12 · Sources: dated, click-verified OSINT + operator-verified correspondence (JSJK attendee list). Internal use — strip contact table before external circulation._</w:t>
       </w:r>
     </w:p>
     <w:p>
@@ -2834,6 +2834,531 @@
       </w:r>
     </w:p>
     <w:p>
+      <w:pPr>
+        <w:pStyle w:val="Heading3"/>
+      </w:pPr>
+      <w:r>
+        <w:t>🎯 JSJK briefing — confirmed PDRM attendees (operator-verified list, 12-Oct)</w:t>
+      </w:r>
+    </w:p>
+    <w:tbl>
+      <w:tblPr>
+        <w:tblStyle w:val="LightGrid-Accent1"/>
+        <w:tblW w:type="auto" w:w="0"/>
+        <w:tblLook w:firstColumn="1" w:firstRow="1" w:lastColumn="0" w:lastRow="0" w:noHBand="0" w:noVBand="1" w:val="04A0"/>
+      </w:tblPr>
+      <w:tblGrid>
+        <w:gridCol w:w="2160"/>
+        <w:gridCol w:w="2160"/>
+        <w:gridCol w:w="2160"/>
+        <w:gridCol w:w="2160"/>
+      </w:tblGrid>
+      <w:tr>
+        <w:tc>
+          <w:tcPr>
+            <w:tcW w:type="dxa" w:w="2160"/>
+          </w:tcPr>
+          <w:p>
+            <w:r>
+              <w:rPr>
+                <w:b/>
+              </w:rPr>
+              <w:t>#</w:t>
+            </w:r>
+          </w:p>
+        </w:tc>
+        <w:tc>
+          <w:tcPr>
+            <w:tcW w:type="dxa" w:w="2160"/>
+          </w:tcPr>
+          <w:p>
+            <w:r>
+              <w:rPr>
+                <w:b/>
+              </w:rPr>
+              <w:t>Rank</w:t>
+            </w:r>
+          </w:p>
+        </w:tc>
+        <w:tc>
+          <w:tcPr>
+            <w:tcW w:type="dxa" w:w="2160"/>
+          </w:tcPr>
+          <w:p>
+            <w:r>
+              <w:rPr>
+                <w:b/>
+              </w:rPr>
+              <w:t>Name</w:t>
+            </w:r>
+          </w:p>
+        </w:tc>
+        <w:tc>
+          <w:tcPr>
+            <w:tcW w:type="dxa" w:w="2160"/>
+          </w:tcPr>
+          <w:p>
+            <w:r>
+              <w:rPr>
+                <w:b/>
+              </w:rPr>
+              <w:t>Role</w:t>
+            </w:r>
+          </w:p>
+        </w:tc>
+      </w:tr>
+      <w:tr>
+        <w:tc>
+          <w:tcPr>
+            <w:tcW w:type="dxa" w:w="2160"/>
+          </w:tcPr>
+          <w:p>
+            <w:r>
+              <w:rPr>
+                <w:sz w:val="19"/>
+              </w:rPr>
+              <w:t>1</w:t>
+            </w:r>
+          </w:p>
+        </w:tc>
+        <w:tc>
+          <w:tcPr>
+            <w:tcW w:type="dxa" w:w="2160"/>
+          </w:tcPr>
+          <w:p>
+            <w:r>
+              <w:rPr>
+                <w:b/>
+                <w:sz w:val="19"/>
+              </w:rPr>
+              <w:t>ACP</w:t>
+            </w:r>
+          </w:p>
+        </w:tc>
+        <w:tc>
+          <w:tcPr>
+            <w:tcW w:type="dxa" w:w="2160"/>
+          </w:tcPr>
+          <w:p>
+            <w:r>
+              <w:rPr>
+                <w:b/>
+                <w:sz w:val="19"/>
+              </w:rPr>
+              <w:t>M Zambri bin Mahmod</w:t>
+            </w:r>
+          </w:p>
+        </w:tc>
+        <w:tc>
+          <w:tcPr>
+            <w:tcW w:type="dxa" w:w="2160"/>
+          </w:tcPr>
+          <w:p>
+            <w:r>
+              <w:rPr>
+                <w:b/>
+                <w:sz w:val="19"/>
+              </w:rPr>
+              <w:t>KPP Bahagian Siasatan Perakaunan Forensik / Siasatan Jenayah Cryptocurrency — division head, senior-most</w:t>
+            </w:r>
+          </w:p>
+        </w:tc>
+      </w:tr>
+      <w:tr>
+        <w:tc>
+          <w:tcPr>
+            <w:tcW w:type="dxa" w:w="2160"/>
+          </w:tcPr>
+          <w:p>
+            <w:r>
+              <w:rPr>
+                <w:sz w:val="19"/>
+              </w:rPr>
+              <w:t>2</w:t>
+            </w:r>
+          </w:p>
+        </w:tc>
+        <w:tc>
+          <w:tcPr>
+            <w:tcW w:type="dxa" w:w="2160"/>
+          </w:tcPr>
+          <w:p>
+            <w:r>
+              <w:rPr>
+                <w:sz w:val="19"/>
+              </w:rPr>
+              <w:t>SUPT</w:t>
+            </w:r>
+          </w:p>
+        </w:tc>
+        <w:tc>
+          <w:tcPr>
+            <w:tcW w:type="dxa" w:w="2160"/>
+          </w:tcPr>
+          <w:p>
+            <w:r>
+              <w:rPr>
+                <w:sz w:val="19"/>
+              </w:rPr>
+              <w:t>Mohd Norazizi bin Badri</w:t>
+            </w:r>
+          </w:p>
+        </w:tc>
+        <w:tc>
+          <w:tcPr>
+            <w:tcW w:type="dxa" w:w="2160"/>
+          </w:tcPr>
+          <w:p>
+            <w:r>
+              <w:rPr>
+                <w:sz w:val="19"/>
+              </w:rPr>
+              <w:t>(division not stated)</w:t>
+            </w:r>
+          </w:p>
+        </w:tc>
+      </w:tr>
+      <w:tr>
+        <w:tc>
+          <w:tcPr>
+            <w:tcW w:type="dxa" w:w="2160"/>
+          </w:tcPr>
+          <w:p>
+            <w:r>
+              <w:rPr>
+                <w:sz w:val="19"/>
+              </w:rPr>
+              <w:t>3</w:t>
+            </w:r>
+          </w:p>
+        </w:tc>
+        <w:tc>
+          <w:tcPr>
+            <w:tcW w:type="dxa" w:w="2160"/>
+          </w:tcPr>
+          <w:p>
+            <w:r>
+              <w:rPr>
+                <w:sz w:val="19"/>
+              </w:rPr>
+              <w:t>ASP</w:t>
+            </w:r>
+          </w:p>
+        </w:tc>
+        <w:tc>
+          <w:tcPr>
+            <w:tcW w:type="dxa" w:w="2160"/>
+          </w:tcPr>
+          <w:p>
+            <w:r>
+              <w:rPr>
+                <w:sz w:val="19"/>
+              </w:rPr>
+              <w:t>Norfalisa Hartini bt Kholin</w:t>
+            </w:r>
+          </w:p>
+        </w:tc>
+        <w:tc>
+          <w:tcPr>
+            <w:tcW w:type="dxa" w:w="2160"/>
+          </w:tcPr>
+          <w:p>
+            <w:r>
+              <w:rPr>
+                <w:sz w:val="19"/>
+              </w:rPr>
+              <w:t>(division not stated)</w:t>
+            </w:r>
+          </w:p>
+        </w:tc>
+      </w:tr>
+      <w:tr>
+        <w:tc>
+          <w:tcPr>
+            <w:tcW w:type="dxa" w:w="2160"/>
+          </w:tcPr>
+          <w:p>
+            <w:r>
+              <w:rPr>
+                <w:sz w:val="19"/>
+              </w:rPr>
+              <w:t>4</w:t>
+            </w:r>
+          </w:p>
+        </w:tc>
+        <w:tc>
+          <w:tcPr>
+            <w:tcW w:type="dxa" w:w="2160"/>
+          </w:tcPr>
+          <w:p>
+            <w:r>
+              <w:rPr>
+                <w:sz w:val="19"/>
+              </w:rPr>
+              <w:t>ASP</w:t>
+            </w:r>
+          </w:p>
+        </w:tc>
+        <w:tc>
+          <w:tcPr>
+            <w:tcW w:type="dxa" w:w="2160"/>
+          </w:tcPr>
+          <w:p>
+            <w:r>
+              <w:rPr>
+                <w:sz w:val="19"/>
+              </w:rPr>
+              <w:t>Nurul 'Aqila bt Md. Sedik</w:t>
+            </w:r>
+          </w:p>
+        </w:tc>
+        <w:tc>
+          <w:tcPr>
+            <w:tcW w:type="dxa" w:w="2160"/>
+          </w:tcPr>
+          <w:p>
+            <w:r>
+              <w:rPr>
+                <w:sz w:val="19"/>
+              </w:rPr>
+              <w:t>Kryptowang/crypto-crime — invitation initiator (rank conflict closed: ASP)</w:t>
+            </w:r>
+          </w:p>
+        </w:tc>
+      </w:tr>
+      <w:tr>
+        <w:tc>
+          <w:tcPr>
+            <w:tcW w:type="dxa" w:w="2160"/>
+          </w:tcPr>
+          <w:p>
+            <w:r>
+              <w:rPr>
+                <w:sz w:val="19"/>
+              </w:rPr>
+              <w:t>5</w:t>
+            </w:r>
+          </w:p>
+        </w:tc>
+        <w:tc>
+          <w:tcPr>
+            <w:tcW w:type="dxa" w:w="2160"/>
+          </w:tcPr>
+          <w:p>
+            <w:r>
+              <w:rPr>
+                <w:sz w:val="19"/>
+              </w:rPr>
+              <w:t>Insp</w:t>
+            </w:r>
+          </w:p>
+        </w:tc>
+        <w:tc>
+          <w:tcPr>
+            <w:tcW w:type="dxa" w:w="2160"/>
+          </w:tcPr>
+          <w:p>
+            <w:r>
+              <w:rPr>
+                <w:sz w:val="19"/>
+              </w:rPr>
+              <w:t>E Poh Hua</w:t>
+            </w:r>
+          </w:p>
+        </w:tc>
+        <w:tc>
+          <w:tcPr>
+            <w:tcW w:type="dxa" w:w="2160"/>
+          </w:tcPr>
+          <w:p>
+            <w:r>
+              <w:rPr>
+                <w:sz w:val="19"/>
+              </w:rPr>
+              <w:t>(division not stated)</w:t>
+            </w:r>
+          </w:p>
+        </w:tc>
+      </w:tr>
+      <w:tr>
+        <w:tc>
+          <w:tcPr>
+            <w:tcW w:type="dxa" w:w="2160"/>
+          </w:tcPr>
+          <w:p>
+            <w:r>
+              <w:rPr>
+                <w:sz w:val="19"/>
+              </w:rPr>
+              <w:t>6</w:t>
+            </w:r>
+          </w:p>
+        </w:tc>
+        <w:tc>
+          <w:tcPr>
+            <w:tcW w:type="dxa" w:w="2160"/>
+          </w:tcPr>
+          <w:p>
+            <w:r>
+              <w:rPr>
+                <w:sz w:val="19"/>
+              </w:rPr>
+              <w:t>Insp</w:t>
+            </w:r>
+          </w:p>
+        </w:tc>
+        <w:tc>
+          <w:tcPr>
+            <w:tcW w:type="dxa" w:w="2160"/>
+          </w:tcPr>
+          <w:p>
+            <w:r>
+              <w:rPr>
+                <w:sz w:val="19"/>
+              </w:rPr>
+              <w:t>Mohd Safuan bin Hamdan</w:t>
+            </w:r>
+          </w:p>
+        </w:tc>
+        <w:tc>
+          <w:tcPr>
+            <w:tcW w:type="dxa" w:w="2160"/>
+          </w:tcPr>
+          <w:p>
+            <w:r>
+              <w:rPr>
+                <w:sz w:val="19"/>
+              </w:rPr>
+              <w:t>(division not stated)</w:t>
+            </w:r>
+          </w:p>
+        </w:tc>
+      </w:tr>
+      <w:tr>
+        <w:tc>
+          <w:tcPr>
+            <w:tcW w:type="dxa" w:w="2160"/>
+          </w:tcPr>
+          <w:p>
+            <w:r>
+              <w:rPr>
+                <w:sz w:val="19"/>
+              </w:rPr>
+              <w:t>7</w:t>
+            </w:r>
+          </w:p>
+        </w:tc>
+        <w:tc>
+          <w:tcPr>
+            <w:tcW w:type="dxa" w:w="2160"/>
+          </w:tcPr>
+          <w:p>
+            <w:r>
+              <w:rPr>
+                <w:sz w:val="19"/>
+              </w:rPr>
+              <w:t>Insp</w:t>
+            </w:r>
+          </w:p>
+        </w:tc>
+        <w:tc>
+          <w:tcPr>
+            <w:tcW w:type="dxa" w:w="2160"/>
+          </w:tcPr>
+          <w:p>
+            <w:r>
+              <w:rPr>
+                <w:sz w:val="19"/>
+              </w:rPr>
+              <w:t>Nalini a/p Munusamy</w:t>
+            </w:r>
+          </w:p>
+        </w:tc>
+        <w:tc>
+          <w:tcPr>
+            <w:tcW w:type="dxa" w:w="2160"/>
+          </w:tcPr>
+          <w:p>
+            <w:r>
+              <w:rPr>
+                <w:sz w:val="19"/>
+              </w:rPr>
+              <w:t>(division not stated)</w:t>
+            </w:r>
+          </w:p>
+        </w:tc>
+      </w:tr>
+      <w:tr>
+        <w:tc>
+          <w:tcPr>
+            <w:tcW w:type="dxa" w:w="2160"/>
+          </w:tcPr>
+          <w:p>
+            <w:r>
+              <w:rPr>
+                <w:sz w:val="19"/>
+              </w:rPr>
+              <w:t>8</w:t>
+            </w:r>
+          </w:p>
+        </w:tc>
+        <w:tc>
+          <w:tcPr>
+            <w:tcW w:type="dxa" w:w="2160"/>
+          </w:tcPr>
+          <w:p>
+            <w:r>
+              <w:rPr>
+                <w:sz w:val="19"/>
+              </w:rPr>
+              <w:t>Insp</w:t>
+            </w:r>
+          </w:p>
+        </w:tc>
+        <w:tc>
+          <w:tcPr>
+            <w:tcW w:type="dxa" w:w="2160"/>
+          </w:tcPr>
+          <w:p>
+            <w:r>
+              <w:rPr>
+                <w:sz w:val="19"/>
+              </w:rPr>
+              <w:t>Siti Fatimah bt Abdul Mutalib</w:t>
+            </w:r>
+          </w:p>
+        </w:tc>
+        <w:tc>
+          <w:tcPr>
+            <w:tcW w:type="dxa" w:w="2160"/>
+          </w:tcPr>
+          <w:p>
+            <w:r>
+              <w:rPr>
+                <w:sz w:val="19"/>
+              </w:rPr>
+              <w:t>(division not stated)</w:t>
+            </w:r>
+          </w:p>
+        </w:tc>
+      </w:tr>
+    </w:tbl>
+    <w:p/>
+    <w:p>
+      <w:r>
+        <w:t xml:space="preserve">Reading: an </w:t>
+      </w:r>
+      <w:r>
+        <w:rPr>
+          <w:b/>
+        </w:rPr>
+        <w:t>8-officer working session anchored at division-head level</w:t>
+      </w:r>
+      <w:r>
+        <w:t>, with forensic accounting folded into the crypto-crime bahagian — pitch casework throughput + court-grade output against the RM20m forensics-modernisation line, not a unit-tool demo. Recorded-output walkthrough per Gate-Exception Protocol; no live demo pre-G2.</w:t>
+      </w:r>
+    </w:p>
+    <w:p>
       <w:r>
         <w:rPr>
           <w:b/>

</xml_diff>

<commit_message>
verify(OSINT swarm): attendee verdicts (Poh Hua VERIFIED, Nalini corroborated, 5 not-publicly-found); corrections: JBSS nomenclature, RM20m->D11 attribution, Shamsul Amar portfolio, Fuad CSO role, BNM/CSMY channels; battlemap rebuilt
</commit_message>
<xml_diff>
--- a/roster/MALAYSIA-BATTLEMAP.docx
+++ b/roster/MALAYSIA-BATTLEMAP.docx
@@ -12,7 +12,7 @@
     </w:p>
     <w:p>
       <w:r>
-        <w:t>_Compiled 2026-10-12 · Sources: dated, click-verified OSINT + operator-verified correspondence (JSJK attendee list). Internal use — strip contact table before external circulation._</w:t>
+        <w:t>_Compiled 2026-10-12 (verification pass merged) · Sources: dated OSINT + operator-verified correspondence; per-name verification verdicts recorded. Internal use — strip contact table before external circulation._</w:t>
       </w:r>
     </w:p>
     <w:p>
@@ -2961,6 +2961,12 @@
               </w:rPr>
               <w:t>KPP Bahagian Siasatan Perakaunan Forensik / Siasatan Jenayah Cryptocurrency — division head, senior-most</w:t>
             </w:r>
+            <w:r>
+              <w:rPr>
+                <w:sz w:val="19"/>
+              </w:rPr>
+              <w:t xml:space="preserve"> · ⚠︎ not independently findable (operator channel)</w:t>
+            </w:r>
           </w:p>
         </w:tc>
       </w:tr>
@@ -3013,7 +3019,7 @@
               <w:rPr>
                 <w:sz w:val="19"/>
               </w:rPr>
-              <w:t>(division not stated)</w:t>
+              <w:t>(division not stated) · ⚠︎ not independently found</w:t>
             </w:r>
           </w:p>
         </w:tc>
@@ -3067,7 +3073,7 @@
               <w:rPr>
                 <w:sz w:val="19"/>
               </w:rPr>
-              <w:t>(division not stated)</w:t>
+              <w:t>(division not stated) · ⚠︎ not independently found</w:t>
             </w:r>
           </w:p>
         </w:tc>
@@ -3121,7 +3127,20 @@
               <w:rPr>
                 <w:sz w:val="19"/>
               </w:rPr>
-              <w:t>Kryptowang/crypto-crime — invitation initiator (rank conflict closed: ASP)</w:t>
+              <w:t xml:space="preserve">crypto unit (PDRM public name: </w:t>
+            </w:r>
+            <w:r>
+              <w:rPr>
+                <w:b/>
+                <w:sz w:val="19"/>
+              </w:rPr>
+              <w:t>Unit Mata Wang Kripto</w:t>
+            </w:r>
+            <w:r>
+              <w:rPr>
+                <w:sz w:val="19"/>
+              </w:rPr>
+              <w:t>) — invitation initiator · LinkedIn RMP match indirect, identity unconfirmed</w:t>
             </w:r>
           </w:p>
         </w:tc>
@@ -3173,9 +3192,29 @@
           <w:p>
             <w:r>
               <w:rPr>
+                <w:b/>
                 <w:sz w:val="19"/>
               </w:rPr>
-              <w:t>(division not stated)</w:t>
+              <w:t>CCID crypto</w:t>
+            </w:r>
+            <w:r>
+              <w:rPr>
+                <w:sz w:val="19"/>
+              </w:rPr>
+              <w:t xml:space="preserve"> — ✅ </w:t>
+            </w:r>
+            <w:r>
+              <w:rPr>
+                <w:b/>
+                <w:sz w:val="19"/>
+              </w:rPr>
+              <w:t>VERIFIED</w:t>
+            </w:r>
+            <w:r>
+              <w:rPr>
+                <w:sz w:val="19"/>
+              </w:rPr>
+              <w:t>: Bitcoin Malaysia Conf 2024 agenda, PDRM CCID, talk on crypto crimes</w:t>
             </w:r>
           </w:p>
         </w:tc>
@@ -3229,7 +3268,7 @@
               <w:rPr>
                 <w:sz w:val="19"/>
               </w:rPr>
-              <w:t>(division not stated)</w:t>
+              <w:t>(division not stated) · ⚠︎ not independently found</w:t>
             </w:r>
           </w:p>
         </w:tc>
@@ -3283,7 +3322,20 @@
               <w:rPr>
                 <w:sz w:val="19"/>
               </w:rPr>
-              <w:t>(division not stated)</w:t>
+              <w:t xml:space="preserve">🔶 </w:t>
+            </w:r>
+            <w:r>
+              <w:rPr>
+                <w:b/>
+                <w:sz w:val="19"/>
+              </w:rPr>
+              <w:t>CORROBORATED</w:t>
+            </w:r>
+            <w:r>
+              <w:rPr>
+                <w:sz w:val="19"/>
+              </w:rPr>
+              <w:t>: LinkedIn "Insp Dr. Nalini Munusamy — Cryptocurrency Investigation Officer" (employer auth-walled)</w:t>
             </w:r>
           </w:p>
         </w:tc>
@@ -3337,7 +3389,7 @@
               <w:rPr>
                 <w:sz w:val="19"/>
               </w:rPr>
-              <w:t>(division not stated)</w:t>
+              <w:t>(division not stated) · ⚠︎ not independently found</w:t>
             </w:r>
           </w:p>
         </w:tc>
@@ -3346,6 +3398,11 @@
     <w:p/>
     <w:p>
       <w:r>
+        <w:t>Verification note (12-Oct): officer visibility below division-head level is normally non-public — 5× NOT-INDEPENDENTLY-FOUND is expected, not disproof; 1 verified + 1 corroborated support list authenticity. Full sweep: register INT-20261012-001.</w:t>
+      </w:r>
+    </w:p>
+    <w:p>
+      <w:r>
         <w:t xml:space="preserve">Reading: an </w:t>
       </w:r>
       <w:r>
@@ -3355,7 +3412,7 @@
         <w:t>8-officer working session anchored at division-head level</w:t>
       </w:r>
       <w:r>
-        <w:t>, with forensic accounting folded into the crypto-crime bahagian — pitch casework throughput + court-grade output against the RM20m forensics-modernisation line, not a unit-tool demo. Recorded-output walkthrough per Gate-Exception Protocol; no live demo pre-G2.</w:t>
+        <w:t>, with forensic accounting folded into the crypto-crime bahagian — pitch casework throughput + court-grade output against the scam-loss caseload (RM2.97bn, Rusdi Sep-26) — note: the Belanjawan-26 RM20m digital-forensics line attributes to D11 in coverage, do NOT cite it at the JSJK table, not a unit-tool demo. Recorded-output walkthrough per Gate-Exception Protocol; no live demo pre-G2.</w:t>
       </w:r>
     </w:p>
     <w:p>

</xml_diff>